<commit_message>
update document per feedback from Professor.
</commit_message>
<xml_diff>
--- a/project_status_October_6/status/meljahmi_RBE550_October_6_status.docx
+++ b/project_status_October_6/status/meljahmi_RBE550_October_6_status.docx
@@ -180,7 +180,7 @@
         <w:t xml:space="preserve"> </w:t>
       </w:r>
       <w:r>
-        <w:t>This project began with a narrow focus: implementing and benchmarking five classical grid-based search algorithms—Breadth-First Search (BFS), Dijkstra’s algorithm, A*, Theta*, and Jump Point Search (JPS). These methods remain the immediate scope, providing a well-understood testbed where trade-offs in runtime, path length, and node expansions can be compared. The framework is implemented in ROS 2 with Python, with utilities for random obstacle generation, ASCII map loading, start/goal specification, and reproducible benchmarking. At this stage, BFS and A* are implemented and tested, showing the expected contrast between exhaustive exploration and heuristic-guided efficiency. While the foundation is grid-based, the architecture is deliberately extensible: its unified planner interface and benchmarking harness could support future extensions to incremental graph searches for dynamic maps, and even policy-based algorithms from reinforcement learning.</w:t>
+        <w:t>This project began with a narrow focus: implementing and benchmarking five classical grid-based search algorithms—Breadth-First Search (BFS), Dijkstra’s algorithm, A*, Theta*, and Jump Point Search (JPS). These methods remain the immediate scope, providing a well-understood testbed where trade-offs in runtime, path length, and node expansions can be compared. The framework is implemented in ROS 2 with Python, with utilities for random obstacle generation, ASCII map loading, start/goal specification, and reproducible benchmarking. At this stage, BFS and A* are integrated, with benchmarks contrasting uniform-cost exploration against heuristic-guided search under both Manhattan and Euclidean distance heuristics. These comparisons highlight how cost models and heuristic selection affect efficiency and path quality. While the foundation is grid-based, the architecture is deliberately extensible: its unified planner interface and benchmarking harness could support future extensions to incremental graph searches for dynamic maps, and even policy-based algorithms from reinforcement learning.</w:t>
       </w:r>
       <w:r>
         <w:rPr>
@@ -210,10 +210,7 @@
         <w:rPr>
           <w:i w:val="0"/>
         </w:rPr>
-        <w:t>Grid-based motion planning, Breadth-First Search (BFS), Dijkstra’s algorithm, A* algorithm, Theta*, Jump Point Search (JPS), incremental search, policy-based planning, reinforcement learning, benchmarking framework, ROS 2</w:t>
-      </w:r>
-      <w:r>
-        <w:t>.</w:t>
+        <w:t>Grid-based motion planning, Breadth-First Search (BFS), Dijkstra’s algorithm, A* algorithm, Manhattan heuristic, Euclidean heuristic, Theta*, Jump Point Search (JPS), incremental search, policy-based planning, reinforcement learning, benchmarking framework, ROS 2.</w:t>
       </w:r>
     </w:p>
     <w:p>
@@ -245,6 +242,7 @@
     <w:p>
       <w:pPr>
         <w:pStyle w:val="NoSpacing"/>
+        <w:ind w:firstLine="36pt"/>
         <w:jc w:val="start"/>
         <w:rPr>
           <w:sz w:val="18"/>
@@ -256,56 +254,54 @@
       <w:pPr>
         <w:pStyle w:val="NoSpacing"/>
         <w:jc w:val="start"/>
-      </w:pPr>
-      <w:r>
-        <w:rPr>
-          <w:sz w:val="18"/>
-          <w:szCs w:val="18"/>
-        </w:rPr>
-        <w:t>Classical grid-based planners such as Breadth-First Search (BFS), Dijkstra’s algorithm, and A* are widely studied because they guarantee optimal solutions under appropriate cost models. More advanced methods such as Theta* and Jump Point Search (JPS) further improve efficiency by reducing node expansions or enabling any-angle paths. Each algorithm exhibits trade-offs in runtime, memory</w:t>
-      </w:r>
-      <w:r>
-        <w:t xml:space="preserve"> usage, and path quality, making systematic evaluation important for both education and practical deployment.</w:t>
+        <w:rPr>
+          <w:sz w:val="18"/>
+          <w:szCs w:val="18"/>
+        </w:rPr>
+      </w:pPr>
+      <w:r>
+        <w:rPr>
+          <w:sz w:val="18"/>
+          <w:szCs w:val="18"/>
+        </w:rPr>
+        <w:t xml:space="preserve">Classical grid-based planners such as Breadth-First Search (BFS), Dijkstra’s algorithm, and A* are widely studied because they guarantee optimal solutions under appropriate cost models. BFS explores in uniform steps without considering costs, while Dijkstra extends this to weighted graphs by </w:t>
+      </w:r>
+      <w:r>
+        <w:t xml:space="preserve">minimizing cumulative cost. A* further introduces heuristics, and its performance depends strongly on the heuristic function chosen—for example, Manhattan distance is consistent with 4-connected grids, while </w:t>
+      </w:r>
+      <w:r>
+        <w:rPr>
+          <w:sz w:val="18"/>
+          <w:szCs w:val="18"/>
+        </w:rPr>
+        <w:t>Euclidean distance matches 8-connected grids where diagonal moves cost √2. More advanced methods such as Theta* and Jump Point Search (JPS) improve efficiency by reducing node expansions or enabling any-angle paths. Each algorithm exhibits trade-offs in runtime, memory usage, and path quality, making systematic evaluation important for both education and practical deployment.</w:t>
       </w:r>
     </w:p>
     <w:p>
       <w:pPr>
         <w:pStyle w:val="NoSpacing"/>
         <w:jc w:val="start"/>
-        <w:rPr>
-          <w:sz w:val="18"/>
-          <w:szCs w:val="18"/>
-        </w:rPr>
-      </w:pPr>
-      <w:r>
-        <w:rPr>
-          <w:sz w:val="18"/>
-          <w:szCs w:val="18"/>
-        </w:rPr>
-        <w:t xml:space="preserve">This project began with a deliberately narrow focus: to implement and benchmark these five classical grid-based planners in a consistent setting. Implemented in ROS 2 with Python, the </w:t>
-      </w:r>
-      <w:r>
-        <w:rPr>
-          <w:sz w:val="18"/>
-          <w:szCs w:val="18"/>
-        </w:rPr>
-        <w:t>framework provides random obstacle generation, ASCII map loading, start/goal specification, and benchmarking utilities. Algorithms can be executed under identical conditions, and metrics such as path length, number of turns, nodes expanded, runtime, and memory consumption are recorded.</w:t>
-      </w:r>
+      </w:pPr>
     </w:p>
     <w:p>
       <w:pPr>
         <w:pStyle w:val="NoSpacing"/>
         <w:jc w:val="start"/>
-        <w:rPr>
-          <w:sz w:val="18"/>
-          <w:szCs w:val="18"/>
-        </w:rPr>
-      </w:pPr>
+      </w:pPr>
+      <w:r>
+        <w:t>This project began with a deliberately narrow focus: to implement and benchmark these five classical grid-based planners in a consistent setting. Implemented in ROS 2 with Python, the framework provides random obstacle generation, ASCII map loading, start/goal specification, and benchmarking utilities. Algorithms can be executed under identical conditions, and metrics such as path length, number of turns, nodes expanded, runtime, and memory consumption are recorded.</w:t>
+      </w:r>
     </w:p>
     <w:p>
       <w:pPr>
         <w:pStyle w:val="NoSpacing"/>
         <w:jc w:val="start"/>
+      </w:pPr>
+    </w:p>
+    <w:p>
+      <w:pPr>
+        <w:pStyle w:val="NoSpacing"/>
+        <w:jc w:val="start"/>
         <w:rPr>
           <w:sz w:val="18"/>
           <w:szCs w:val="18"/>
@@ -318,6 +314,15 @@
         </w:rPr>
         <w:t>By October 6, the framework will include initial implementations of BFS and A*, enabling preliminary results on random and structured maps. Dijkstra, Theta*, and JPS will be added in subsequent iterations. While the near-term scope is restricted to grid-based graph searches, the architecture is flexible and extensible: the same benchmarking structure could, in future work, support incremental planners for dynamic maps or even policy-based approaches from reinforcement learning.</w:t>
       </w:r>
+    </w:p>
+    <w:p>
+      <w:pPr>
+        <w:jc w:val="start"/>
+        <w:rPr>
+          <w:sz w:val="18"/>
+          <w:szCs w:val="18"/>
+        </w:rPr>
+      </w:pPr>
     </w:p>
     <w:p>
       <w:pPr>
@@ -390,6 +395,7 @@
           <w:sz w:val="18"/>
           <w:szCs w:val="18"/>
         </w:rPr>
+        <w:lastRenderedPageBreak/>
         <w:t>Dijkstra’s Algorithm</w:t>
       </w:r>
     </w:p>
@@ -447,14 +453,7 @@
           <w:sz w:val="18"/>
           <w:szCs w:val="18"/>
         </w:rPr>
-        <w:t>A* improves on Dijkstra by adding a heuristic estimate of cost-to-go (e.g., Manhattan or Euclidean distance). A* reduces the number of expansions while still guaranteeing an optimal path if the heuristic is admissible</w:t>
-      </w:r>
-      <w:r>
-        <w:rPr>
-          <w:sz w:val="18"/>
-          <w:szCs w:val="18"/>
-        </w:rPr>
-        <w:t>.</w:t>
+        <w:t>A* improves on Dijkstra by adding a heuristic estimate of cost-to-go, enabling the search to focus on states that appear closer to the goal. Its effectiveness depends on both the cost model and the heuristic function. For 4-connected grids with unit step costs, the Manhattan distance is admissible and consistent. For 8-connected grids, where diagonal moves are allowed with cost √2, the Euclidean distance provides a more accurate admissible heuristic. These variations highlight that A* is not a single method but a family of approaches, and the choice of heuristic directly influences runtime, node expansions, and overall efficiency while still preserving optimality.</w:t>
       </w:r>
     </w:p>
     <w:p>
@@ -487,15 +486,7 @@
           <w:sz w:val="18"/>
           <w:szCs w:val="18"/>
         </w:rPr>
-        <w:t xml:space="preserve">Theta* is a variation of A* that allows any-angle shortcuts rather than restricting paths to grid edges. This reduces unnecessary turns </w:t>
-      </w:r>
-      <w:r>
-        <w:rPr>
-          <w:sz w:val="18"/>
-          <w:szCs w:val="18"/>
-        </w:rPr>
-        <w:lastRenderedPageBreak/>
-        <w:t>and often produces shorter, more natural-looking paths, while maintaining efficiency</w:t>
+        <w:t>Theta* is a variation of A* that allows any-angle shortcuts rather than restricting paths to grid edges. This reduces unnecessary turns and often produces shorter, more natural-looking paths, while maintaining efficiency</w:t>
       </w:r>
       <w:r>
         <w:rPr>
@@ -535,7 +526,23 @@
           <w:sz w:val="18"/>
           <w:szCs w:val="18"/>
         </w:rPr>
-        <w:t>PS is an optimization for uniform-cost grids that skips over symmetric intermediate states. By “jumping” directly to critical nodes, JPS dramatically reduces the number of expansions while preserving optimality</w:t>
+        <w:t xml:space="preserve">PS is an optimization for uniform-cost grids that </w:t>
+      </w:r>
+      <w:proofErr w:type="gramStart"/>
+      <w:r>
+        <w:rPr>
+          <w:sz w:val="18"/>
+          <w:szCs w:val="18"/>
+        </w:rPr>
+        <w:t>skips</w:t>
+      </w:r>
+      <w:proofErr w:type="gramEnd"/>
+      <w:r>
+        <w:rPr>
+          <w:sz w:val="18"/>
+          <w:szCs w:val="18"/>
+        </w:rPr>
+        <w:t xml:space="preserve"> over symmetric intermediate states. By “jumping” directly to critical nodes, JPS dramatically reduces the number of expansions while preserving optimality</w:t>
       </w:r>
       <w:r>
         <w:rPr>
@@ -1112,7 +1119,23 @@
           <w:sz w:val="18"/>
           <w:szCs w:val="18"/>
         </w:rPr>
-        <w:t xml:space="preserve">def plan(grid, start, goal, </w:t>
+        <w:t xml:space="preserve">def </w:t>
+      </w:r>
+      <w:proofErr w:type="gramStart"/>
+      <w:r>
+        <w:rPr>
+          <w:sz w:val="18"/>
+          <w:szCs w:val="18"/>
+        </w:rPr>
+        <w:t>plan(</w:t>
+      </w:r>
+      <w:proofErr w:type="gramEnd"/>
+      <w:r>
+        <w:rPr>
+          <w:sz w:val="18"/>
+          <w:szCs w:val="18"/>
+        </w:rPr>
+        <w:t xml:space="preserve">grid, start, goal, </w:t>
       </w:r>
       <w:proofErr w:type="spellStart"/>
       <w:r>
@@ -1334,6 +1357,7 @@
     </w:p>
     <w:p>
       <w:pPr>
+        <w:ind w:firstLine="14.40pt"/>
         <w:jc w:val="start"/>
         <w:rPr>
           <w:sz w:val="18"/>
@@ -1345,87 +1369,7 @@
           <w:sz w:val="18"/>
           <w:szCs w:val="18"/>
         </w:rPr>
-        <w:t xml:space="preserve">At this stage, </w:t>
-      </w:r>
-      <w:r>
-        <w:rPr>
-          <w:b/>
-          <w:bCs/>
-          <w:sz w:val="18"/>
-          <w:szCs w:val="18"/>
-        </w:rPr>
-        <w:t>Breadth-First Search (BFS)</w:t>
-      </w:r>
-      <w:r>
-        <w:rPr>
-          <w:sz w:val="18"/>
-          <w:szCs w:val="18"/>
-        </w:rPr>
-        <w:t xml:space="preserve"> and </w:t>
-      </w:r>
-      <w:r>
-        <w:rPr>
-          <w:b/>
-          <w:bCs/>
-          <w:sz w:val="18"/>
-          <w:szCs w:val="18"/>
-        </w:rPr>
-        <w:t>A*</w:t>
-      </w:r>
-      <w:r>
-        <w:rPr>
-          <w:sz w:val="18"/>
-          <w:szCs w:val="18"/>
-        </w:rPr>
-        <w:t xml:space="preserve"> are being integrated as baseline algorithms. BFS is implemented with a queue-based frontier, while A* uses a priority queue guided by Euclidean distance as a heuristic. Additional algorithms—</w:t>
-      </w:r>
-      <w:r>
-        <w:rPr>
-          <w:b/>
-          <w:bCs/>
-          <w:sz w:val="18"/>
-          <w:szCs w:val="18"/>
-        </w:rPr>
-        <w:t>Dijkstra</w:t>
-      </w:r>
-      <w:r>
-        <w:rPr>
-          <w:sz w:val="18"/>
-          <w:szCs w:val="18"/>
-        </w:rPr>
-        <w:t xml:space="preserve">, </w:t>
-      </w:r>
-      <w:r>
-        <w:rPr>
-          <w:b/>
-          <w:bCs/>
-          <w:sz w:val="18"/>
-          <w:szCs w:val="18"/>
-        </w:rPr>
-        <w:t>Theta*</w:t>
-      </w:r>
-      <w:r>
-        <w:rPr>
-          <w:sz w:val="18"/>
-          <w:szCs w:val="18"/>
-        </w:rPr>
-        <w:t xml:space="preserve">, and </w:t>
-      </w:r>
-      <w:r>
-        <w:rPr>
-          <w:b/>
-          <w:bCs/>
-          <w:sz w:val="18"/>
-          <w:szCs w:val="18"/>
-        </w:rPr>
-        <w:t>Jump Point Search (JPS)</w:t>
-      </w:r>
-      <w:r>
-        <w:rPr>
-          <w:sz w:val="18"/>
-          <w:szCs w:val="18"/>
-        </w:rPr>
-        <w:t>—will be incorporated using the same interface to enable fair comparisons.</w:t>
+        <w:t>At this stage, Breadth-First Search (BFS) and A* are being integrated as baseline algorithms. BFS is implemented with a queue-based frontier and uniform step costs. A* uses a priority queue guided by admissible heuristics, with support for both Manhattan distance (appropriate for 4-connected grids with unit costs) and Euclidean distance (appropriate for 8-connected grids with diagonal moves costing √2). This allows benchmarking of multiple A* variants to study how heuristic selection influences efficiency and path quality. Additional algorithms—Dijkstra, Theta*, and Jump Point Search (JPS)—will be incorporated using the same interface to enable fair comparisons.</w:t>
       </w:r>
     </w:p>
     <w:p>
@@ -1537,7 +1481,10 @@
         <w:t>. Class diagram of algorithm modules, showing BFS and A</w:t>
       </w:r>
       <w:r>
-        <w:t xml:space="preserve"> planners inheriting from a common base planner interface.*</w:t>
+        <w:t xml:space="preserve"> planners inheriting from a common base planner </w:t>
+      </w:r>
+      <w:r>
+        <w:t>interface. *</w:t>
       </w:r>
     </w:p>
     <w:p>
@@ -1584,7 +1531,7 @@
       <w:pPr>
         <w:numPr>
           <w:ilvl w:val="0"/>
-          <w:numId w:val="31"/>
+          <w:numId w:val="32"/>
         </w:numPr>
         <w:jc w:val="start"/>
         <w:rPr>
@@ -1594,26 +1541,17 @@
       </w:pPr>
       <w:r>
         <w:rPr>
-          <w:b/>
-          <w:bCs/>
-          <w:sz w:val="18"/>
-          <w:szCs w:val="18"/>
-        </w:rPr>
-        <w:t>Runtime</w:t>
-      </w:r>
-      <w:r>
-        <w:rPr>
-          <w:sz w:val="18"/>
-          <w:szCs w:val="18"/>
-        </w:rPr>
-        <w:t xml:space="preserve"> measured in milliseconds.</w:t>
+          <w:sz w:val="18"/>
+          <w:szCs w:val="18"/>
+        </w:rPr>
+        <w:t>Runtime measured in milliseconds</w:t>
       </w:r>
     </w:p>
     <w:p>
       <w:pPr>
         <w:numPr>
           <w:ilvl w:val="0"/>
-          <w:numId w:val="31"/>
+          <w:numId w:val="32"/>
         </w:numPr>
         <w:jc w:val="start"/>
         <w:rPr>
@@ -1623,26 +1561,17 @@
       </w:pPr>
       <w:r>
         <w:rPr>
-          <w:b/>
-          <w:bCs/>
-          <w:sz w:val="18"/>
-          <w:szCs w:val="18"/>
-        </w:rPr>
-        <w:t>Nodes expanded</w:t>
-      </w:r>
-      <w:r>
-        <w:rPr>
-          <w:sz w:val="18"/>
-          <w:szCs w:val="18"/>
-        </w:rPr>
-        <w:t xml:space="preserve"> during search.</w:t>
+          <w:sz w:val="18"/>
+          <w:szCs w:val="18"/>
+        </w:rPr>
+        <w:t>Nodes expanded during search</w:t>
       </w:r>
     </w:p>
     <w:p>
       <w:pPr>
         <w:numPr>
           <w:ilvl w:val="0"/>
-          <w:numId w:val="31"/>
+          <w:numId w:val="32"/>
         </w:numPr>
         <w:jc w:val="start"/>
         <w:rPr>
@@ -1652,26 +1581,17 @@
       </w:pPr>
       <w:r>
         <w:rPr>
-          <w:b/>
-          <w:bCs/>
-          <w:sz w:val="18"/>
-          <w:szCs w:val="18"/>
-        </w:rPr>
-        <w:t>Path length</w:t>
-      </w:r>
-      <w:r>
-        <w:rPr>
-          <w:sz w:val="18"/>
-          <w:szCs w:val="18"/>
-        </w:rPr>
-        <w:t xml:space="preserve"> (number of steps).</w:t>
+          <w:sz w:val="18"/>
+          <w:szCs w:val="18"/>
+        </w:rPr>
+        <w:t>Path length (number of steps)</w:t>
       </w:r>
     </w:p>
     <w:p>
       <w:pPr>
         <w:numPr>
           <w:ilvl w:val="0"/>
-          <w:numId w:val="31"/>
+          <w:numId w:val="32"/>
         </w:numPr>
         <w:jc w:val="start"/>
         <w:rPr>
@@ -1681,26 +1601,17 @@
       </w:pPr>
       <w:r>
         <w:rPr>
-          <w:b/>
-          <w:bCs/>
-          <w:sz w:val="18"/>
-          <w:szCs w:val="18"/>
-        </w:rPr>
-        <w:t>Number of turns</w:t>
-      </w:r>
-      <w:r>
-        <w:rPr>
-          <w:sz w:val="18"/>
-          <w:szCs w:val="18"/>
-        </w:rPr>
-        <w:t xml:space="preserve"> (optional, for later integration).</w:t>
+          <w:sz w:val="18"/>
+          <w:szCs w:val="18"/>
+        </w:rPr>
+        <w:t>Number of turns (optional, for later integration)</w:t>
       </w:r>
     </w:p>
     <w:p>
       <w:pPr>
         <w:numPr>
           <w:ilvl w:val="0"/>
-          <w:numId w:val="31"/>
+          <w:numId w:val="32"/>
         </w:numPr>
         <w:jc w:val="start"/>
         <w:rPr>
@@ -1710,19 +1621,10 @@
       </w:pPr>
       <w:r>
         <w:rPr>
-          <w:b/>
-          <w:bCs/>
-          <w:sz w:val="18"/>
-          <w:szCs w:val="18"/>
-        </w:rPr>
-        <w:t>Memory usage</w:t>
-      </w:r>
-      <w:r>
-        <w:rPr>
-          <w:sz w:val="18"/>
-          <w:szCs w:val="18"/>
-        </w:rPr>
-        <w:t xml:space="preserve"> of open and closed lists.</w:t>
+          <w:sz w:val="18"/>
+          <w:szCs w:val="18"/>
+        </w:rPr>
+        <w:t>Memory usage of open and closed lists</w:t>
       </w:r>
     </w:p>
     <w:p>
@@ -1738,8 +1640,23 @@
           <w:sz w:val="18"/>
           <w:szCs w:val="18"/>
         </w:rPr>
-        <w:lastRenderedPageBreak/>
-        <w:t>Each run reports results in a structured format, printed to the console and optionally saved for later analysis. The harness ensures that all planners are evaluated under identical conditions.</w:t>
+        <w:t xml:space="preserve">Each run reports results in a structured format, printed to the console and optionally saved for later analysis. The harness ensures that all planners are evaluated under identical conditions. </w:t>
+      </w:r>
+      <w:proofErr w:type="gramStart"/>
+      <w:r>
+        <w:rPr>
+          <w:sz w:val="18"/>
+          <w:szCs w:val="18"/>
+        </w:rPr>
+        <w:t>In particular, it</w:t>
+      </w:r>
+      <w:proofErr w:type="gramEnd"/>
+      <w:r>
+        <w:rPr>
+          <w:sz w:val="18"/>
+          <w:szCs w:val="18"/>
+        </w:rPr>
+        <w:t xml:space="preserve"> supports varying the cost model (4-connected vs. 8-connected grids) and heuristic functions (Manhattan vs. Euclidean) so that differences between algorithmic approaches can be measured systematically.</w:t>
       </w:r>
     </w:p>
     <w:p>
@@ -1871,14 +1788,7 @@
           <w:sz w:val="18"/>
           <w:szCs w:val="18"/>
         </w:rPr>
-        <w:t>I</w:t>
-      </w:r>
-      <w:r>
-        <w:rPr>
-          <w:sz w:val="18"/>
-          <w:szCs w:val="18"/>
-        </w:rPr>
-        <w:t>V</w:t>
+        <w:t>IV</w:t>
       </w:r>
       <w:r>
         <w:rPr>
@@ -2704,6 +2614,155 @@
     </w:lvl>
   </w:abstractNum>
   <w:abstractNum w:abstractNumId="12" w15:restartNumberingAfterBreak="0">
+    <w:nsid w:val="0D260FBE"/>
+    <w:multiLevelType w:val="multilevel"/>
+    <w:tmpl w:val="1D48CE8C"/>
+    <w:lvl w:ilvl="0">
+      <w:start w:val="1"/>
+      <w:numFmt w:val="bullet"/>
+      <w:lvlText w:val=""/>
+      <w:lvlJc w:val="start"/>
+      <w:pPr>
+        <w:tabs>
+          <w:tab w:val="num" w:pos="36pt"/>
+        </w:tabs>
+        <w:ind w:start="36pt" w:hanging="18pt"/>
+      </w:pPr>
+      <w:rPr>
+        <w:rFonts w:ascii="Symbol" w:hAnsi="Symbol" w:hint="default"/>
+        <w:sz w:val="20"/>
+      </w:rPr>
+    </w:lvl>
+    <w:lvl w:ilvl="1" w:tentative="1">
+      <w:start w:val="1"/>
+      <w:numFmt w:val="bullet"/>
+      <w:lvlText w:val="o"/>
+      <w:lvlJc w:val="start"/>
+      <w:pPr>
+        <w:tabs>
+          <w:tab w:val="num" w:pos="72pt"/>
+        </w:tabs>
+        <w:ind w:start="72pt" w:hanging="18pt"/>
+      </w:pPr>
+      <w:rPr>
+        <w:rFonts w:ascii="Courier New" w:hAnsi="Courier New" w:hint="default"/>
+        <w:sz w:val="20"/>
+      </w:rPr>
+    </w:lvl>
+    <w:lvl w:ilvl="2" w:tentative="1">
+      <w:start w:val="1"/>
+      <w:numFmt w:val="bullet"/>
+      <w:lvlText w:val=""/>
+      <w:lvlJc w:val="start"/>
+      <w:pPr>
+        <w:tabs>
+          <w:tab w:val="num" w:pos="108pt"/>
+        </w:tabs>
+        <w:ind w:start="108pt" w:hanging="18pt"/>
+      </w:pPr>
+      <w:rPr>
+        <w:rFonts w:ascii="Wingdings" w:hAnsi="Wingdings" w:hint="default"/>
+        <w:sz w:val="20"/>
+      </w:rPr>
+    </w:lvl>
+    <w:lvl w:ilvl="3" w:tentative="1">
+      <w:start w:val="1"/>
+      <w:numFmt w:val="bullet"/>
+      <w:lvlText w:val=""/>
+      <w:lvlJc w:val="start"/>
+      <w:pPr>
+        <w:tabs>
+          <w:tab w:val="num" w:pos="144pt"/>
+        </w:tabs>
+        <w:ind w:start="144pt" w:hanging="18pt"/>
+      </w:pPr>
+      <w:rPr>
+        <w:rFonts w:ascii="Wingdings" w:hAnsi="Wingdings" w:hint="default"/>
+        <w:sz w:val="20"/>
+      </w:rPr>
+    </w:lvl>
+    <w:lvl w:ilvl="4" w:tentative="1">
+      <w:start w:val="1"/>
+      <w:numFmt w:val="bullet"/>
+      <w:lvlText w:val=""/>
+      <w:lvlJc w:val="start"/>
+      <w:pPr>
+        <w:tabs>
+          <w:tab w:val="num" w:pos="180pt"/>
+        </w:tabs>
+        <w:ind w:start="180pt" w:hanging="18pt"/>
+      </w:pPr>
+      <w:rPr>
+        <w:rFonts w:ascii="Wingdings" w:hAnsi="Wingdings" w:hint="default"/>
+        <w:sz w:val="20"/>
+      </w:rPr>
+    </w:lvl>
+    <w:lvl w:ilvl="5" w:tentative="1">
+      <w:start w:val="1"/>
+      <w:numFmt w:val="bullet"/>
+      <w:lvlText w:val=""/>
+      <w:lvlJc w:val="start"/>
+      <w:pPr>
+        <w:tabs>
+          <w:tab w:val="num" w:pos="216pt"/>
+        </w:tabs>
+        <w:ind w:start="216pt" w:hanging="18pt"/>
+      </w:pPr>
+      <w:rPr>
+        <w:rFonts w:ascii="Wingdings" w:hAnsi="Wingdings" w:hint="default"/>
+        <w:sz w:val="20"/>
+      </w:rPr>
+    </w:lvl>
+    <w:lvl w:ilvl="6" w:tentative="1">
+      <w:start w:val="1"/>
+      <w:numFmt w:val="bullet"/>
+      <w:lvlText w:val=""/>
+      <w:lvlJc w:val="start"/>
+      <w:pPr>
+        <w:tabs>
+          <w:tab w:val="num" w:pos="252pt"/>
+        </w:tabs>
+        <w:ind w:start="252pt" w:hanging="18pt"/>
+      </w:pPr>
+      <w:rPr>
+        <w:rFonts w:ascii="Wingdings" w:hAnsi="Wingdings" w:hint="default"/>
+        <w:sz w:val="20"/>
+      </w:rPr>
+    </w:lvl>
+    <w:lvl w:ilvl="7" w:tentative="1">
+      <w:start w:val="1"/>
+      <w:numFmt w:val="bullet"/>
+      <w:lvlText w:val=""/>
+      <w:lvlJc w:val="start"/>
+      <w:pPr>
+        <w:tabs>
+          <w:tab w:val="num" w:pos="288pt"/>
+        </w:tabs>
+        <w:ind w:start="288pt" w:hanging="18pt"/>
+      </w:pPr>
+      <w:rPr>
+        <w:rFonts w:ascii="Wingdings" w:hAnsi="Wingdings" w:hint="default"/>
+        <w:sz w:val="20"/>
+      </w:rPr>
+    </w:lvl>
+    <w:lvl w:ilvl="8" w:tentative="1">
+      <w:start w:val="1"/>
+      <w:numFmt w:val="bullet"/>
+      <w:lvlText w:val=""/>
+      <w:lvlJc w:val="start"/>
+      <w:pPr>
+        <w:tabs>
+          <w:tab w:val="num" w:pos="324pt"/>
+        </w:tabs>
+        <w:ind w:start="324pt" w:hanging="18pt"/>
+      </w:pPr>
+      <w:rPr>
+        <w:rFonts w:ascii="Wingdings" w:hAnsi="Wingdings" w:hint="default"/>
+        <w:sz w:val="20"/>
+      </w:rPr>
+    </w:lvl>
+  </w:abstractNum>
+  <w:abstractNum w:abstractNumId="13" w15:restartNumberingAfterBreak="0">
     <w:nsid w:val="186217F3"/>
     <w:multiLevelType w:val="hybridMultilevel"/>
     <w:tmpl w:val="E10AEFFE"/>
@@ -2816,7 +2875,7 @@
       </w:rPr>
     </w:lvl>
   </w:abstractNum>
-  <w:abstractNum w:abstractNumId="13" w15:restartNumberingAfterBreak="0">
+  <w:abstractNum w:abstractNumId="14" w15:restartNumberingAfterBreak="0">
     <w:nsid w:val="1E177E97"/>
     <w:multiLevelType w:val="hybridMultilevel"/>
     <w:tmpl w:val="A6463BCE"/>
@@ -2902,7 +2961,7 @@
       </w:pPr>
     </w:lvl>
   </w:abstractNum>
-  <w:abstractNum w:abstractNumId="14" w15:restartNumberingAfterBreak="0">
+  <w:abstractNum w:abstractNumId="15" w15:restartNumberingAfterBreak="0">
     <w:nsid w:val="20AF0333"/>
     <w:multiLevelType w:val="hybridMultilevel"/>
     <w:tmpl w:val="CB0E7F4E"/>
@@ -3044,7 +3103,7 @@
       </w:rPr>
     </w:lvl>
   </w:abstractNum>
-  <w:abstractNum w:abstractNumId="15" w15:restartNumberingAfterBreak="0">
+  <w:abstractNum w:abstractNumId="16" w15:restartNumberingAfterBreak="0">
     <w:nsid w:val="26943618"/>
     <w:multiLevelType w:val="multilevel"/>
     <w:tmpl w:val="F74E2C36"/>
@@ -3193,7 +3252,7 @@
       </w:rPr>
     </w:lvl>
   </w:abstractNum>
-  <w:abstractNum w:abstractNumId="16" w15:restartNumberingAfterBreak="0">
+  <w:abstractNum w:abstractNumId="17" w15:restartNumberingAfterBreak="0">
     <w:nsid w:val="26FE1FCF"/>
     <w:multiLevelType w:val="hybridMultilevel"/>
     <w:tmpl w:val="33826962"/>
@@ -3354,7 +3413,7 @@
       </w:rPr>
     </w:lvl>
   </w:abstractNum>
-  <w:abstractNum w:abstractNumId="17" w15:restartNumberingAfterBreak="0">
+  <w:abstractNum w:abstractNumId="18" w15:restartNumberingAfterBreak="0">
     <w:nsid w:val="37660336"/>
     <w:multiLevelType w:val="hybridMultilevel"/>
     <w:tmpl w:val="754EAC84"/>
@@ -3495,7 +3554,7 @@
       </w:rPr>
     </w:lvl>
   </w:abstractNum>
-  <w:abstractNum w:abstractNumId="18" w15:restartNumberingAfterBreak="0">
+  <w:abstractNum w:abstractNumId="19" w15:restartNumberingAfterBreak="0">
     <w:nsid w:val="39E54FC6"/>
     <w:multiLevelType w:val="singleLevel"/>
     <w:tmpl w:val="5B7288D4"/>
@@ -3515,7 +3574,7 @@
       </w:rPr>
     </w:lvl>
   </w:abstractNum>
-  <w:abstractNum w:abstractNumId="19" w15:restartNumberingAfterBreak="0">
+  <w:abstractNum w:abstractNumId="20" w15:restartNumberingAfterBreak="0">
     <w:nsid w:val="3BDD560A"/>
     <w:multiLevelType w:val="hybridMultilevel"/>
     <w:tmpl w:val="EC5C338C"/>
@@ -3628,7 +3687,7 @@
       </w:rPr>
     </w:lvl>
   </w:abstractNum>
-  <w:abstractNum w:abstractNumId="20" w15:restartNumberingAfterBreak="0">
+  <w:abstractNum w:abstractNumId="21" w15:restartNumberingAfterBreak="0">
     <w:nsid w:val="4189603E"/>
     <w:multiLevelType w:val="multilevel"/>
     <w:tmpl w:val="0AB06E12"/>
@@ -3835,7 +3894,7 @@
       </w:rPr>
     </w:lvl>
   </w:abstractNum>
-  <w:abstractNum w:abstractNumId="21" w15:restartNumberingAfterBreak="0">
+  <w:abstractNum w:abstractNumId="22" w15:restartNumberingAfterBreak="0">
     <w:nsid w:val="41C01C63"/>
     <w:multiLevelType w:val="multilevel"/>
     <w:tmpl w:val="58CAB6CE"/>
@@ -3984,7 +4043,7 @@
       </w:rPr>
     </w:lvl>
   </w:abstractNum>
-  <w:abstractNum w:abstractNumId="22" w15:restartNumberingAfterBreak="0">
+  <w:abstractNum w:abstractNumId="23" w15:restartNumberingAfterBreak="0">
     <w:nsid w:val="493C3F76"/>
     <w:multiLevelType w:val="hybridMultilevel"/>
     <w:tmpl w:val="9A9E418C"/>
@@ -4095,7 +4154,7 @@
       </w:pPr>
     </w:lvl>
   </w:abstractNum>
-  <w:abstractNum w:abstractNumId="23" w15:restartNumberingAfterBreak="0">
+  <w:abstractNum w:abstractNumId="24" w15:restartNumberingAfterBreak="0">
     <w:nsid w:val="52CA544A"/>
     <w:multiLevelType w:val="singleLevel"/>
     <w:tmpl w:val="AED6D67E"/>
@@ -4122,7 +4181,7 @@
       </w:rPr>
     </w:lvl>
   </w:abstractNum>
-  <w:abstractNum w:abstractNumId="24" w15:restartNumberingAfterBreak="0">
+  <w:abstractNum w:abstractNumId="25" w15:restartNumberingAfterBreak="0">
     <w:nsid w:val="59851F56"/>
     <w:multiLevelType w:val="multilevel"/>
     <w:tmpl w:val="C6368F24"/>
@@ -4271,7 +4330,7 @@
       </w:rPr>
     </w:lvl>
   </w:abstractNum>
-  <w:abstractNum w:abstractNumId="25" w15:restartNumberingAfterBreak="0">
+  <w:abstractNum w:abstractNumId="26" w15:restartNumberingAfterBreak="0">
     <w:nsid w:val="6C402C58"/>
     <w:multiLevelType w:val="hybridMultilevel"/>
     <w:tmpl w:val="9A1CA078"/>
@@ -4416,7 +4475,7 @@
       </w:rPr>
     </w:lvl>
   </w:abstractNum>
-  <w:abstractNum w:abstractNumId="26" w15:restartNumberingAfterBreak="0">
+  <w:abstractNum w:abstractNumId="27" w15:restartNumberingAfterBreak="0">
     <w:nsid w:val="6CD32DA8"/>
     <w:multiLevelType w:val="singleLevel"/>
     <w:tmpl w:val="166470C2"/>
@@ -4443,40 +4502,40 @@
     </w:lvl>
   </w:abstractNum>
   <w:num w:numId="1" w16cid:durableId="940377641">
+    <w:abstractNumId w:val="18"/>
+  </w:num>
+  <w:num w:numId="2" w16cid:durableId="1397439891">
+    <w:abstractNumId w:val="26"/>
+  </w:num>
+  <w:num w:numId="3" w16cid:durableId="539585121">
     <w:abstractNumId w:val="17"/>
   </w:num>
-  <w:num w:numId="2" w16cid:durableId="1397439891">
-    <w:abstractNumId w:val="25"/>
-  </w:num>
-  <w:num w:numId="3" w16cid:durableId="539585121">
-    <w:abstractNumId w:val="16"/>
-  </w:num>
   <w:num w:numId="4" w16cid:durableId="1505513160">
-    <w:abstractNumId w:val="20"/>
+    <w:abstractNumId w:val="21"/>
   </w:num>
   <w:num w:numId="5" w16cid:durableId="978925957">
-    <w:abstractNumId w:val="20"/>
+    <w:abstractNumId w:val="21"/>
   </w:num>
   <w:num w:numId="6" w16cid:durableId="1721400726">
-    <w:abstractNumId w:val="20"/>
+    <w:abstractNumId w:val="21"/>
   </w:num>
   <w:num w:numId="7" w16cid:durableId="687826470">
-    <w:abstractNumId w:val="20"/>
+    <w:abstractNumId w:val="21"/>
   </w:num>
   <w:num w:numId="8" w16cid:durableId="143812469">
-    <w:abstractNumId w:val="23"/>
+    <w:abstractNumId w:val="24"/>
   </w:num>
   <w:num w:numId="9" w16cid:durableId="1364867722">
-    <w:abstractNumId w:val="26"/>
+    <w:abstractNumId w:val="27"/>
   </w:num>
   <w:num w:numId="10" w16cid:durableId="2029989048">
-    <w:abstractNumId w:val="18"/>
+    <w:abstractNumId w:val="19"/>
   </w:num>
   <w:num w:numId="11" w16cid:durableId="642739898">
-    <w:abstractNumId w:val="14"/>
+    <w:abstractNumId w:val="15"/>
   </w:num>
   <w:num w:numId="12" w16cid:durableId="1272741182">
-    <w:abstractNumId w:val="13"/>
+    <w:abstractNumId w:val="14"/>
   </w:num>
   <w:num w:numId="13" w16cid:durableId="851069540">
     <w:abstractNumId w:val="0"/>
@@ -4512,28 +4571,31 @@
     <w:abstractNumId w:val="1"/>
   </w:num>
   <w:num w:numId="24" w16cid:durableId="1366640472">
+    <w:abstractNumId w:val="23"/>
+  </w:num>
+  <w:num w:numId="25" w16cid:durableId="1917282883">
+    <w:abstractNumId w:val="24"/>
+  </w:num>
+  <w:num w:numId="26" w16cid:durableId="1466772736">
+    <w:abstractNumId w:val="13"/>
+  </w:num>
+  <w:num w:numId="27" w16cid:durableId="1057825152">
     <w:abstractNumId w:val="22"/>
   </w:num>
-  <w:num w:numId="25" w16cid:durableId="1917282883">
-    <w:abstractNumId w:val="23"/>
-  </w:num>
-  <w:num w:numId="26" w16cid:durableId="1466772736">
-    <w:abstractNumId w:val="12"/>
-  </w:num>
-  <w:num w:numId="27" w16cid:durableId="1057825152">
-    <w:abstractNumId w:val="21"/>
-  </w:num>
   <w:num w:numId="28" w16cid:durableId="1769081536">
-    <w:abstractNumId w:val="24"/>
+    <w:abstractNumId w:val="25"/>
   </w:num>
   <w:num w:numId="29" w16cid:durableId="913012818">
-    <w:abstractNumId w:val="19"/>
+    <w:abstractNumId w:val="20"/>
   </w:num>
   <w:num w:numId="30" w16cid:durableId="1016923067">
-    <w:abstractNumId w:val="15"/>
+    <w:abstractNumId w:val="16"/>
   </w:num>
   <w:num w:numId="31" w16cid:durableId="115874739">
     <w:abstractNumId w:val="11"/>
+  </w:num>
+  <w:num w:numId="32" w16cid:durableId="734859783">
+    <w:abstractNumId w:val="12"/>
   </w:num>
 </w:numbering>
 </file>

</xml_diff>

<commit_message>
add preliminary results, future work, conculsion.
</commit_message>
<xml_diff>
--- a/project_status_October_6/status/meljahmi_RBE550_October_6_status.docx
+++ b/project_status_October_6/status/meljahmi_RBE550_October_6_status.docx
@@ -1809,6 +1809,583 @@
     </w:p>
     <w:p>
       <w:pPr>
+        <w:jc w:val="start"/>
+        <w:rPr>
+          <w:sz w:val="18"/>
+          <w:szCs w:val="18"/>
+        </w:rPr>
+      </w:pPr>
+      <w:r>
+        <w:rPr>
+          <w:sz w:val="18"/>
+          <w:szCs w:val="18"/>
+        </w:rPr>
+        <w:t>Table I reports early results on a 64×64 random grid with 20% obstacle fill (seeded for reproducibility). BFS expands substantially more nodes than A*, while A* with an admissible heuristic significantly reduces expansion and runtime. With 8-connected moves and Euclidean distance, A* produces shorter paths with further efficiency gains.</w:t>
+      </w:r>
+    </w:p>
+    <w:p>
+      <w:pPr>
+        <w:jc w:val="start"/>
+        <w:rPr>
+          <w:sz w:val="18"/>
+          <w:szCs w:val="18"/>
+        </w:rPr>
+      </w:pPr>
+    </w:p>
+    <w:tbl>
+      <w:tblPr>
+        <w:tblStyle w:val="TableGrid"/>
+        <w:tblW w:w="279.80pt" w:type="dxa"/>
+        <w:tblLook w:firstRow="1" w:lastRow="0" w:firstColumn="1" w:lastColumn="0" w:noHBand="0" w:noVBand="1"/>
+      </w:tblPr>
+      <w:tblGrid>
+        <w:gridCol w:w="966"/>
+        <w:gridCol w:w="1146"/>
+        <w:gridCol w:w="986"/>
+        <w:gridCol w:w="726"/>
+        <w:gridCol w:w="936"/>
+        <w:gridCol w:w="836"/>
+      </w:tblGrid>
+      <w:tr>
+        <w:tc>
+          <w:tcPr>
+            <w:tcW w:w="48.30pt" w:type="dxa"/>
+          </w:tcPr>
+          <w:p>
+            <w:pPr>
+              <w:jc w:val="start"/>
+              <w:rPr>
+                <w:sz w:val="18"/>
+                <w:szCs w:val="18"/>
+              </w:rPr>
+            </w:pPr>
+            <w:r>
+              <w:rPr>
+                <w:sz w:val="18"/>
+                <w:szCs w:val="18"/>
+              </w:rPr>
+              <w:t>Algorithm</w:t>
+            </w:r>
+          </w:p>
+        </w:tc>
+        <w:tc>
+          <w:tcPr>
+            <w:tcW w:w="57.30pt" w:type="dxa"/>
+          </w:tcPr>
+          <w:p>
+            <w:pPr>
+              <w:jc w:val="start"/>
+              <w:rPr>
+                <w:sz w:val="18"/>
+                <w:szCs w:val="18"/>
+              </w:rPr>
+            </w:pPr>
+            <w:r>
+              <w:rPr>
+                <w:sz w:val="18"/>
+                <w:szCs w:val="18"/>
+              </w:rPr>
+              <w:t>Connectivity</w:t>
+            </w:r>
+          </w:p>
+        </w:tc>
+        <w:tc>
+          <w:tcPr>
+            <w:tcW w:w="49.30pt" w:type="dxa"/>
+          </w:tcPr>
+          <w:p>
+            <w:pPr>
+              <w:jc w:val="start"/>
+              <w:rPr>
+                <w:sz w:val="18"/>
+                <w:szCs w:val="18"/>
+              </w:rPr>
+            </w:pPr>
+            <w:r>
+              <w:rPr>
+                <w:sz w:val="18"/>
+                <w:szCs w:val="18"/>
+              </w:rPr>
+              <w:t>Heuristic</w:t>
+            </w:r>
+          </w:p>
+        </w:tc>
+        <w:tc>
+          <w:tcPr>
+            <w:tcW w:w="36.30pt" w:type="dxa"/>
+          </w:tcPr>
+          <w:p>
+            <w:pPr>
+              <w:jc w:val="start"/>
+              <w:rPr>
+                <w:sz w:val="18"/>
+                <w:szCs w:val="18"/>
+              </w:rPr>
+            </w:pPr>
+            <w:r>
+              <w:rPr>
+                <w:sz w:val="18"/>
+                <w:szCs w:val="18"/>
+              </w:rPr>
+              <w:t>Path Length</w:t>
+            </w:r>
+          </w:p>
+        </w:tc>
+        <w:tc>
+          <w:tcPr>
+            <w:tcW w:w="46.80pt" w:type="dxa"/>
+          </w:tcPr>
+          <w:p>
+            <w:pPr>
+              <w:jc w:val="start"/>
+              <w:rPr>
+                <w:sz w:val="18"/>
+                <w:szCs w:val="18"/>
+              </w:rPr>
+            </w:pPr>
+            <w:r>
+              <w:rPr>
+                <w:sz w:val="18"/>
+                <w:szCs w:val="18"/>
+              </w:rPr>
+              <w:t>Nodes Expanded</w:t>
+            </w:r>
+          </w:p>
+        </w:tc>
+        <w:tc>
+          <w:tcPr>
+            <w:tcW w:w="41.80pt" w:type="dxa"/>
+          </w:tcPr>
+          <w:p>
+            <w:pPr>
+              <w:jc w:val="start"/>
+              <w:rPr>
+                <w:sz w:val="18"/>
+                <w:szCs w:val="18"/>
+              </w:rPr>
+            </w:pPr>
+            <w:r>
+              <w:rPr>
+                <w:sz w:val="18"/>
+                <w:szCs w:val="18"/>
+              </w:rPr>
+              <w:t>Runtime (</w:t>
+            </w:r>
+            <w:proofErr w:type="spellStart"/>
+            <w:r>
+              <w:rPr>
+                <w:sz w:val="18"/>
+                <w:szCs w:val="18"/>
+              </w:rPr>
+              <w:t>ms</w:t>
+            </w:r>
+            <w:proofErr w:type="spellEnd"/>
+            <w:r>
+              <w:rPr>
+                <w:sz w:val="18"/>
+                <w:szCs w:val="18"/>
+              </w:rPr>
+              <w:t>)</w:t>
+            </w:r>
+          </w:p>
+        </w:tc>
+      </w:tr>
+      <w:tr>
+        <w:tc>
+          <w:tcPr>
+            <w:tcW w:w="48.30pt" w:type="dxa"/>
+          </w:tcPr>
+          <w:p>
+            <w:pPr>
+              <w:jc w:val="start"/>
+              <w:rPr>
+                <w:sz w:val="18"/>
+                <w:szCs w:val="18"/>
+              </w:rPr>
+            </w:pPr>
+            <w:r>
+              <w:rPr>
+                <w:sz w:val="18"/>
+                <w:szCs w:val="18"/>
+              </w:rPr>
+              <w:t>BFS</w:t>
+            </w:r>
+          </w:p>
+        </w:tc>
+        <w:tc>
+          <w:tcPr>
+            <w:tcW w:w="57.30pt" w:type="dxa"/>
+          </w:tcPr>
+          <w:p>
+            <w:pPr>
+              <w:jc w:val="start"/>
+              <w:rPr>
+                <w:sz w:val="18"/>
+                <w:szCs w:val="18"/>
+              </w:rPr>
+            </w:pPr>
+            <w:r>
+              <w:rPr>
+                <w:sz w:val="18"/>
+                <w:szCs w:val="18"/>
+              </w:rPr>
+              <w:t>4</w:t>
+            </w:r>
+          </w:p>
+        </w:tc>
+        <w:tc>
+          <w:tcPr>
+            <w:tcW w:w="49.30pt" w:type="dxa"/>
+          </w:tcPr>
+          <w:p>
+            <w:pPr>
+              <w:jc w:val="start"/>
+              <w:rPr>
+                <w:sz w:val="18"/>
+                <w:szCs w:val="18"/>
+              </w:rPr>
+            </w:pPr>
+            <w:r>
+              <w:rPr>
+                <w:sz w:val="18"/>
+                <w:szCs w:val="18"/>
+              </w:rPr>
+              <w:t>-</w:t>
+            </w:r>
+          </w:p>
+        </w:tc>
+        <w:tc>
+          <w:tcPr>
+            <w:tcW w:w="36.30pt" w:type="dxa"/>
+          </w:tcPr>
+          <w:p>
+            <w:pPr>
+              <w:jc w:val="start"/>
+              <w:rPr>
+                <w:sz w:val="18"/>
+                <w:szCs w:val="18"/>
+              </w:rPr>
+            </w:pPr>
+            <w:r>
+              <w:rPr>
+                <w:sz w:val="18"/>
+                <w:szCs w:val="18"/>
+              </w:rPr>
+              <w:t>64</w:t>
+            </w:r>
+          </w:p>
+        </w:tc>
+        <w:tc>
+          <w:tcPr>
+            <w:tcW w:w="46.80pt" w:type="dxa"/>
+          </w:tcPr>
+          <w:p>
+            <w:pPr>
+              <w:jc w:val="start"/>
+              <w:rPr>
+                <w:sz w:val="18"/>
+                <w:szCs w:val="18"/>
+              </w:rPr>
+            </w:pPr>
+            <w:r>
+              <w:rPr>
+                <w:sz w:val="18"/>
+                <w:szCs w:val="18"/>
+              </w:rPr>
+              <w:t>2155</w:t>
+            </w:r>
+          </w:p>
+        </w:tc>
+        <w:tc>
+          <w:tcPr>
+            <w:tcW w:w="41.80pt" w:type="dxa"/>
+          </w:tcPr>
+          <w:p>
+            <w:pPr>
+              <w:jc w:val="start"/>
+              <w:rPr>
+                <w:sz w:val="18"/>
+                <w:szCs w:val="18"/>
+              </w:rPr>
+            </w:pPr>
+            <w:r>
+              <w:rPr>
+                <w:sz w:val="18"/>
+                <w:szCs w:val="18"/>
+              </w:rPr>
+              <w:t>2.39</w:t>
+            </w:r>
+          </w:p>
+        </w:tc>
+      </w:tr>
+      <w:tr>
+        <w:tc>
+          <w:tcPr>
+            <w:tcW w:w="48.30pt" w:type="dxa"/>
+          </w:tcPr>
+          <w:p>
+            <w:pPr>
+              <w:jc w:val="start"/>
+              <w:rPr>
+                <w:sz w:val="18"/>
+                <w:szCs w:val="18"/>
+              </w:rPr>
+            </w:pPr>
+            <w:r>
+              <w:rPr>
+                <w:sz w:val="18"/>
+                <w:szCs w:val="18"/>
+              </w:rPr>
+              <w:t>A*</w:t>
+            </w:r>
+          </w:p>
+        </w:tc>
+        <w:tc>
+          <w:tcPr>
+            <w:tcW w:w="57.30pt" w:type="dxa"/>
+          </w:tcPr>
+          <w:p>
+            <w:pPr>
+              <w:jc w:val="start"/>
+              <w:rPr>
+                <w:sz w:val="18"/>
+                <w:szCs w:val="18"/>
+              </w:rPr>
+            </w:pPr>
+            <w:r>
+              <w:rPr>
+                <w:sz w:val="18"/>
+                <w:szCs w:val="18"/>
+              </w:rPr>
+              <w:t>4</w:t>
+            </w:r>
+          </w:p>
+        </w:tc>
+        <w:tc>
+          <w:tcPr>
+            <w:tcW w:w="49.30pt" w:type="dxa"/>
+          </w:tcPr>
+          <w:p>
+            <w:pPr>
+              <w:jc w:val="start"/>
+              <w:rPr>
+                <w:sz w:val="18"/>
+                <w:szCs w:val="18"/>
+              </w:rPr>
+            </w:pPr>
+            <w:r>
+              <w:rPr>
+                <w:sz w:val="18"/>
+                <w:szCs w:val="18"/>
+              </w:rPr>
+              <w:t>Manhattan</w:t>
+            </w:r>
+          </w:p>
+        </w:tc>
+        <w:tc>
+          <w:tcPr>
+            <w:tcW w:w="36.30pt" w:type="dxa"/>
+          </w:tcPr>
+          <w:p>
+            <w:pPr>
+              <w:jc w:val="start"/>
+              <w:rPr>
+                <w:sz w:val="18"/>
+                <w:szCs w:val="18"/>
+              </w:rPr>
+            </w:pPr>
+            <w:r>
+              <w:rPr>
+                <w:sz w:val="18"/>
+                <w:szCs w:val="18"/>
+              </w:rPr>
+              <w:t>64</w:t>
+            </w:r>
+          </w:p>
+        </w:tc>
+        <w:tc>
+          <w:tcPr>
+            <w:tcW w:w="46.80pt" w:type="dxa"/>
+          </w:tcPr>
+          <w:p>
+            <w:pPr>
+              <w:jc w:val="start"/>
+              <w:rPr>
+                <w:sz w:val="18"/>
+                <w:szCs w:val="18"/>
+              </w:rPr>
+            </w:pPr>
+            <w:r>
+              <w:rPr>
+                <w:sz w:val="18"/>
+                <w:szCs w:val="18"/>
+              </w:rPr>
+              <w:t>910</w:t>
+            </w:r>
+          </w:p>
+        </w:tc>
+        <w:tc>
+          <w:tcPr>
+            <w:tcW w:w="41.80pt" w:type="dxa"/>
+          </w:tcPr>
+          <w:p>
+            <w:pPr>
+              <w:jc w:val="start"/>
+              <w:rPr>
+                <w:sz w:val="18"/>
+                <w:szCs w:val="18"/>
+              </w:rPr>
+            </w:pPr>
+            <w:r>
+              <w:rPr>
+                <w:sz w:val="18"/>
+                <w:szCs w:val="18"/>
+              </w:rPr>
+              <w:t>1.93</w:t>
+            </w:r>
+          </w:p>
+        </w:tc>
+      </w:tr>
+      <w:tr>
+        <w:tc>
+          <w:tcPr>
+            <w:tcW w:w="48.30pt" w:type="dxa"/>
+          </w:tcPr>
+          <w:p>
+            <w:pPr>
+              <w:jc w:val="start"/>
+              <w:rPr>
+                <w:sz w:val="18"/>
+                <w:szCs w:val="18"/>
+              </w:rPr>
+            </w:pPr>
+            <w:r>
+              <w:rPr>
+                <w:sz w:val="18"/>
+                <w:szCs w:val="18"/>
+              </w:rPr>
+              <w:t>A*</w:t>
+            </w:r>
+          </w:p>
+        </w:tc>
+        <w:tc>
+          <w:tcPr>
+            <w:tcW w:w="57.30pt" w:type="dxa"/>
+          </w:tcPr>
+          <w:p>
+            <w:pPr>
+              <w:jc w:val="start"/>
+              <w:rPr>
+                <w:sz w:val="18"/>
+                <w:szCs w:val="18"/>
+              </w:rPr>
+            </w:pPr>
+            <w:r>
+              <w:rPr>
+                <w:sz w:val="18"/>
+                <w:szCs w:val="18"/>
+              </w:rPr>
+              <w:t>8</w:t>
+            </w:r>
+          </w:p>
+        </w:tc>
+        <w:tc>
+          <w:tcPr>
+            <w:tcW w:w="49.30pt" w:type="dxa"/>
+          </w:tcPr>
+          <w:p>
+            <w:pPr>
+              <w:jc w:val="start"/>
+              <w:rPr>
+                <w:sz w:val="18"/>
+                <w:szCs w:val="18"/>
+              </w:rPr>
+            </w:pPr>
+            <w:r>
+              <w:rPr>
+                <w:sz w:val="18"/>
+                <w:szCs w:val="18"/>
+              </w:rPr>
+              <w:t>Euclidean</w:t>
+            </w:r>
+          </w:p>
+        </w:tc>
+        <w:tc>
+          <w:tcPr>
+            <w:tcW w:w="36.30pt" w:type="dxa"/>
+          </w:tcPr>
+          <w:p>
+            <w:pPr>
+              <w:jc w:val="start"/>
+              <w:rPr>
+                <w:sz w:val="18"/>
+                <w:szCs w:val="18"/>
+              </w:rPr>
+            </w:pPr>
+            <w:r>
+              <w:rPr>
+                <w:sz w:val="18"/>
+                <w:szCs w:val="18"/>
+              </w:rPr>
+              <w:t>45</w:t>
+            </w:r>
+          </w:p>
+        </w:tc>
+        <w:tc>
+          <w:tcPr>
+            <w:tcW w:w="46.80pt" w:type="dxa"/>
+          </w:tcPr>
+          <w:p>
+            <w:pPr>
+              <w:jc w:val="start"/>
+              <w:rPr>
+                <w:sz w:val="18"/>
+                <w:szCs w:val="18"/>
+              </w:rPr>
+            </w:pPr>
+            <w:r>
+              <w:rPr>
+                <w:sz w:val="18"/>
+                <w:szCs w:val="18"/>
+              </w:rPr>
+              <w:t>455</w:t>
+            </w:r>
+          </w:p>
+        </w:tc>
+        <w:tc>
+          <w:tcPr>
+            <w:tcW w:w="41.80pt" w:type="dxa"/>
+          </w:tcPr>
+          <w:p>
+            <w:pPr>
+              <w:jc w:val="start"/>
+              <w:rPr>
+                <w:sz w:val="18"/>
+                <w:szCs w:val="18"/>
+              </w:rPr>
+            </w:pPr>
+            <w:r>
+              <w:rPr>
+                <w:sz w:val="18"/>
+                <w:szCs w:val="18"/>
+              </w:rPr>
+              <w:t>1.81</w:t>
+            </w:r>
+          </w:p>
+        </w:tc>
+      </w:tr>
+    </w:tbl>
+    <w:p>
+      <w:pPr>
+        <w:jc w:val="start"/>
+        <w:rPr>
+          <w:sz w:val="18"/>
+          <w:szCs w:val="18"/>
+        </w:rPr>
+      </w:pPr>
+    </w:p>
+    <w:p>
+      <w:pPr>
         <w:pStyle w:val="Heading1"/>
       </w:pPr>
       <w:r>
@@ -1817,18 +2394,153 @@
     </w:p>
     <w:p>
       <w:pPr>
+        <w:pStyle w:val="NoSpacing"/>
+        <w:jc w:val="start"/>
+        <w:rPr>
+          <w:sz w:val="18"/>
+          <w:szCs w:val="18"/>
+        </w:rPr>
+      </w:pPr>
+      <w:r>
+        <w:rPr>
+          <w:sz w:val="18"/>
+          <w:szCs w:val="18"/>
+        </w:rPr>
+        <w:t>The immediate challenge is extending the current framework to incorporate the remaining planned algorithms—Dijkstra’s algorithm, Theta*, and Jump Point Search (JPS). Each requires careful integration into the common planner interface so that results remain directly comparable across methods. Beyond implementing the algorithms, additional effort is needed to ensure that metrics such as number of turns, memory consumption of open and closed lists, and success rates over multiple random seeds are systematically recorded and analyzed.</w:t>
+      </w:r>
+    </w:p>
+    <w:p>
+      <w:pPr>
+        <w:pStyle w:val="NoSpacing"/>
+        <w:jc w:val="start"/>
+      </w:pPr>
+    </w:p>
+    <w:p>
+      <w:pPr>
+        <w:pStyle w:val="NoSpacing"/>
+        <w:jc w:val="start"/>
+        <w:rPr>
+          <w:sz w:val="18"/>
+          <w:szCs w:val="18"/>
+        </w:rPr>
+      </w:pPr>
+      <w:r>
+        <w:t>Another challenge is expanding the scope of benchmarking. While preliminary results have been demonstrated on a single seeded random grid, the framework should be exercised across grids of different sizes, obstacle densities, and structured ASCII maps. T</w:t>
+      </w:r>
+      <w:r>
+        <w:rPr>
+          <w:sz w:val="18"/>
+          <w:szCs w:val="18"/>
+        </w:rPr>
+        <w:t>his will enable a more comprehensive comparison and reduce the influence of any one map configuration. CSV logging and automated plotting will also be added to support aggregate statistics and reproducible figures.</w:t>
+      </w:r>
+    </w:p>
+    <w:p>
+      <w:pPr>
+        <w:pStyle w:val="NoSpacing"/>
+        <w:jc w:val="start"/>
+      </w:pPr>
+    </w:p>
+    <w:p>
+      <w:pPr>
+        <w:pStyle w:val="NoSpacing"/>
+        <w:jc w:val="start"/>
+        <w:rPr>
+          <w:sz w:val="18"/>
+          <w:szCs w:val="18"/>
+        </w:rPr>
+      </w:pPr>
+      <w:r>
+        <w:rPr>
+          <w:sz w:val="18"/>
+          <w:szCs w:val="18"/>
+        </w:rPr>
+        <w:lastRenderedPageBreak/>
+        <w:t>Future iterations will focus on broadening the range of evaluated approaches. Variants of A* with weighted heuristics (</w:t>
+      </w:r>
+      <w:proofErr w:type="spellStart"/>
+      <w:r>
+        <w:rPr>
+          <w:sz w:val="18"/>
+          <w:szCs w:val="18"/>
+        </w:rPr>
+        <w:t>wA</w:t>
+      </w:r>
+      <w:proofErr w:type="spellEnd"/>
+      <w:r>
+        <w:rPr>
+          <w:sz w:val="18"/>
+          <w:szCs w:val="18"/>
+        </w:rPr>
+        <w:t>*) can be used to study suboptimality–efficiency trade-offs. Theta* will highlight the effect of allowing any-angle shortcuts, and JPS will demonstrate pruning-based acceleration in uniform-cost grids. Beyond the five core algorithms, the extensible design allows exploration of incremental search algorithms such as D* Lite, and in the longer term, policy-based methods inspired by reinforcement learning.</w:t>
+      </w:r>
+    </w:p>
+    <w:p>
+      <w:pPr>
+        <w:jc w:val="start"/>
+      </w:pPr>
+    </w:p>
+    <w:p>
+      <w:pPr>
         <w:pStyle w:val="Heading1"/>
       </w:pPr>
       <w:r>
         <w:t>Conclusion</w:t>
       </w:r>
     </w:p>
-    <w:p/>
-    <w:p/>
-    <w:p>
-      <w:pPr>
-        <w:pStyle w:val="BodyText"/>
-      </w:pPr>
+    <w:p>
+      <w:pPr>
+        <w:pStyle w:val="NoSpacing"/>
+        <w:jc w:val="start"/>
+        <w:rPr>
+          <w:sz w:val="18"/>
+          <w:szCs w:val="18"/>
+        </w:rPr>
+      </w:pPr>
+      <w:r>
+        <w:rPr>
+          <w:sz w:val="18"/>
+          <w:szCs w:val="18"/>
+        </w:rPr>
+        <w:t>This project presents an extensible benchmarking framework for grid-based motion planning, developed in ROS 2 with Python. The framework provides consistent interfaces, reproducible experiment setup, and metrics reporting across multiple planners. Early experiments have confirmed the functionality of the system and demonstrated how cost models and heuristic choices influence search efficiency and path quality.</w:t>
+      </w:r>
+    </w:p>
+    <w:p>
+      <w:pPr>
+        <w:pStyle w:val="NoSpacing"/>
+        <w:jc w:val="start"/>
+        <w:rPr>
+          <w:sz w:val="18"/>
+          <w:szCs w:val="18"/>
+        </w:rPr>
+      </w:pPr>
+    </w:p>
+    <w:p>
+      <w:pPr>
+        <w:pStyle w:val="NoSpacing"/>
+        <w:jc w:val="start"/>
+        <w:rPr>
+          <w:sz w:val="18"/>
+          <w:szCs w:val="18"/>
+        </w:rPr>
+      </w:pPr>
+      <w:r>
+        <w:rPr>
+          <w:sz w:val="18"/>
+          <w:szCs w:val="18"/>
+        </w:rPr>
+        <w:t xml:space="preserve">Although only a subset of the planned algorithms has been integrated so far, the foundation is in place for systematic evaluation of Breadth-First Search, Dijkstra’s algorithm, A*, Theta*, and Jump Point Search. The framework is deliberately designed to support additional planners, richer metrics, and automated analysis. Future iterations will expand both the algorithm set and the benchmarking scope, ultimately enabling a comprehensive study of classical </w:t>
+      </w:r>
+      <w:r>
+        <w:t xml:space="preserve">search </w:t>
+      </w:r>
+      <w:r>
+        <w:rPr>
+          <w:sz w:val="18"/>
+          <w:szCs w:val="18"/>
+        </w:rPr>
+        <w:t>methods and their trade-offs in runtime, path quality, and memory usage.</w:t>
+      </w:r>
     </w:p>
     <w:p>
       <w:pPr>
@@ -5019,6 +5731,7 @@
   <w:style w:type="character" w:default="1" w:styleId="DefaultParagraphFont">
     <w:name w:val="Default Paragraph Font"/>
     <w:uiPriority w:val="1"/>
+    <w:semiHidden/>
     <w:unhideWhenUsed/>
   </w:style>
   <w:style w:type="table" w:default="1" w:styleId="TableNormal">
@@ -5390,6 +6103,21 @@
       <w:contextualSpacing/>
     </w:pPr>
   </w:style>
+  <w:style w:type="table" w:styleId="TableGrid">
+    <w:name w:val="Table Grid"/>
+    <w:basedOn w:val="TableNormal"/>
+    <w:rsid w:val="004C2968"/>
+    <w:tblPr>
+      <w:tblBorders>
+        <w:top w:val="single" w:sz="4" w:space="0" w:color="auto"/>
+        <w:start w:val="single" w:sz="4" w:space="0" w:color="auto"/>
+        <w:bottom w:val="single" w:sz="4" w:space="0" w:color="auto"/>
+        <w:end w:val="single" w:sz="4" w:space="0" w:color="auto"/>
+        <w:insideH w:val="single" w:sz="4" w:space="0" w:color="auto"/>
+        <w:insideV w:val="single" w:sz="4" w:space="0" w:color="auto"/>
+      </w:tblBorders>
+    </w:tblPr>
+  </w:style>
 </w:styles>
 </file>
 

</xml_diff>

<commit_message>
prep for submission and update the document.
</commit_message>
<xml_diff>
--- a/project_status_October_6/status/meljahmi_RBE550_October_6_status.docx
+++ b/project_status_October_6/status/meljahmi_RBE550_October_6_status.docx
@@ -528,15 +528,7 @@
         <w:t>J</w:t>
       </w:r>
       <w:r>
-        <w:t xml:space="preserve">PS is an optimization for uniform-cost grids that </w:t>
-      </w:r>
-      <w:proofErr w:type="gramStart"/>
-      <w:r>
-        <w:t>skips</w:t>
-      </w:r>
-      <w:proofErr w:type="gramEnd"/>
-      <w:r>
-        <w:t xml:space="preserve"> over symmetric intermediate states. By “jumping” directly to critical nodes, JPS dramatically reduces the number of expansions while preserving optimality</w:t>
+        <w:t>PS is an optimization for uniform-cost grids that skips over symmetric intermediate states. By “jumping” directly to critical nodes, JPS dramatically reduces the number of expansions while preserving optimality</w:t>
       </w:r>
       <w:r>
         <w:t>.</w:t>
@@ -733,7 +725,6 @@
       <w:r>
         <w:t xml:space="preserve">, provides the benchmarking utilities and planner implementations. The build system is based on </w:t>
       </w:r>
-      <w:proofErr w:type="spellStart"/>
       <w:r>
         <w:rPr>
           <w:b/>
@@ -755,7 +746,6 @@
         </w:rPr>
         <w:t>on</w:t>
       </w:r>
-      <w:proofErr w:type="spellEnd"/>
       <w:r>
         <w:t>, and helper scripts (build.sh and run.sh) simplify compilation, environment setup, and experiment execution.</w:t>
       </w:r>
@@ -954,23 +944,7 @@
         <w:jc w:val="start"/>
       </w:pPr>
       <w:r>
-        <w:t xml:space="preserve">def </w:t>
-      </w:r>
-      <w:proofErr w:type="gramStart"/>
-      <w:r>
-        <w:t>plan(</w:t>
-      </w:r>
-      <w:proofErr w:type="gramEnd"/>
-      <w:r>
-        <w:t xml:space="preserve">grid, start, goal, </w:t>
-      </w:r>
-      <w:proofErr w:type="spellStart"/>
-      <w:r>
-        <w:t>neighbors_fn</w:t>
-      </w:r>
-      <w:proofErr w:type="spellEnd"/>
-      <w:r>
-        <w:t>) -&gt; (path, stats)</w:t>
+        <w:t>def plan(grid, start, goal, neighbors_fn) -&gt; (path, stats)</w:t>
       </w:r>
     </w:p>
     <w:p>
@@ -1023,13 +997,8 @@
         </w:numPr>
         <w:jc w:val="start"/>
       </w:pPr>
-      <w:proofErr w:type="spellStart"/>
-      <w:r>
-        <w:t>neighbors_fn</w:t>
-      </w:r>
-      <w:proofErr w:type="spellEnd"/>
-      <w:r>
-        <w:t xml:space="preserve"> selects 4- or 8-connected motion.</w:t>
+      <w:r>
+        <w:t>neighbors_fn selects 4- or 8-connected motion.</w:t>
       </w:r>
     </w:p>
     <w:p>
@@ -1389,15 +1358,7 @@
         </w:rPr>
       </w:pPr>
       <w:r>
-        <w:t xml:space="preserve">Each run reports results in a structured format, printed to the console and optionally saved for later analysis. The harness ensures that all planners are evaluated under identical conditions. </w:t>
-      </w:r>
-      <w:proofErr w:type="gramStart"/>
-      <w:r>
-        <w:t>In particular, it</w:t>
-      </w:r>
-      <w:proofErr w:type="gramEnd"/>
-      <w:r>
-        <w:t xml:space="preserve"> supports varying the cost model (4-connected vs. 8-connected grids) and heuristic functions (Manhattan vs. Euclidean) so that differences between </w:t>
+        <w:t xml:space="preserve">Each run reports results in a structured format, printed to the console and optionally saved for later analysis. The harness ensures that all planners are evaluated under identical conditions. In particular, it supports varying the cost model (4-connected vs. 8-connected grids) and heuristic functions (Manhattan vs. Euclidean) so that differences between </w:t>
       </w:r>
       <w:r>
         <w:t>algorithmic approaches can be measured systematically.</w:t>
@@ -1526,51 +1487,196 @@
         <w:jc w:val="start"/>
       </w:pPr>
       <w:r>
-        <w:t xml:space="preserve">The complete ROS 2 workspace ros2projrbe550_ws will be submitted (without </w:t>
-      </w:r>
-      <w:proofErr w:type="gramStart"/>
-      <w:r>
-        <w:t>build</w:t>
-      </w:r>
-      <w:proofErr w:type="gramEnd"/>
-      <w:r>
-        <w:t xml:space="preserve"> artifacts). Reproducibility depends on the workspace structure and </w:t>
-      </w:r>
-      <w:proofErr w:type="spellStart"/>
-      <w:r>
-        <w:t>colcon</w:t>
-      </w:r>
-      <w:proofErr w:type="spellEnd"/>
-      <w:r>
-        <w:t xml:space="preserve"> build system; therefore, individual source files alone are insufficient. The submission includes </w:t>
-      </w:r>
-      <w:proofErr w:type="spellStart"/>
-      <w:r>
-        <w:t>src</w:t>
-      </w:r>
-      <w:proofErr w:type="spellEnd"/>
-      <w:r>
-        <w:t xml:space="preserve">/rbe550_grid_bench/ (algorithms, nodes, utilities), launch/ files (e.g., bench.launch.py), maps/ (e.g., maze_32.txt), and scripts/ (build.sh, run.sh, run_random64.sh, run_maze32.sh), plus package metadata (package.xml, setup.py, </w:t>
-      </w:r>
-      <w:proofErr w:type="spellStart"/>
-      <w:r>
-        <w:t>setup.cfg</w:t>
-      </w:r>
-      <w:proofErr w:type="spellEnd"/>
-      <w:r>
-        <w:t>). Exclude generated directories build/, install/, and log/. To reproduce:</w:t>
-      </w:r>
-    </w:p>
-    <w:p>
-      <w:pPr>
-        <w:jc w:val="start"/>
-      </w:pPr>
-      <w:r>
-        <w:t>cd ~/ros2projrbe550_ws</w:t>
-      </w:r>
-    </w:p>
-    <w:p>
-      <w:pPr>
+        <w:t>The complete ROS 2 workspace RBE550-Workspace is hosted on GitHub and packaged for fully reproducible runs through Docker. The repository includes:</w:t>
+      </w:r>
+    </w:p>
+    <w:p>
+      <w:pPr>
+        <w:numPr>
+          <w:ilvl w:val="0"/>
+          <w:numId w:val="35"/>
+        </w:numPr>
+        <w:jc w:val="start"/>
+      </w:pPr>
+      <w:r>
+        <w:t>src/rbe550_grid_bench/ — core ROS 2 package (BFS and A* implementations).</w:t>
+      </w:r>
+    </w:p>
+    <w:p>
+      <w:pPr>
+        <w:numPr>
+          <w:ilvl w:val="0"/>
+          <w:numId w:val="35"/>
+        </w:numPr>
+        <w:jc w:val="start"/>
+      </w:pPr>
+      <w:r>
+        <w:t>maps/ — ASCII map files (e.g., maze_32.txt).</w:t>
+      </w:r>
+    </w:p>
+    <w:p>
+      <w:pPr>
+        <w:numPr>
+          <w:ilvl w:val="0"/>
+          <w:numId w:val="35"/>
+        </w:numPr>
+        <w:jc w:val="start"/>
+      </w:pPr>
+      <w:r>
+        <w:t>scripts/ — helper scripts for build and execution, both local and Docker.</w:t>
+      </w:r>
+    </w:p>
+    <w:p>
+      <w:pPr>
+        <w:numPr>
+          <w:ilvl w:val="0"/>
+          <w:numId w:val="35"/>
+        </w:numPr>
+        <w:jc w:val="start"/>
+      </w:pPr>
+      <w:r>
+        <w:t>Dockerfile and .dockerignore — define a self-contained, reproducible build.</w:t>
+      </w:r>
+    </w:p>
+    <w:p>
+      <w:pPr>
+        <w:numPr>
+          <w:ilvl w:val="0"/>
+          <w:numId w:val="35"/>
+        </w:numPr>
+        <w:jc w:val="start"/>
+      </w:pPr>
+      <w:r>
+        <w:t>README.md — detailed usage instructions.</w:t>
+      </w:r>
+    </w:p>
+    <w:p>
+      <w:pPr>
+        <w:pStyle w:val="ListParagraph"/>
+        <w:numPr>
+          <w:ilvl w:val="0"/>
+          <w:numId w:val="36"/>
+        </w:numPr>
+        <w:jc w:val="start"/>
+      </w:pPr>
+      <w:r>
+        <w:t>Reproducibility via Docker (Recommended)</w:t>
+      </w:r>
+      <w:r>
+        <w:t>:</w:t>
+      </w:r>
+    </w:p>
+    <w:p>
+      <w:pPr>
+        <w:pStyle w:val="ListParagraph"/>
+        <w:jc w:val="start"/>
+      </w:pPr>
+      <w:r>
+        <w:t>Docker ensures identical behavior across platforms without requiring a local ROS 2 installation.</w:t>
+      </w:r>
+      <w:r>
+        <w:br/>
+        <w:t>From any Linux or Windows system with Docker installed:</w:t>
+      </w:r>
+    </w:p>
+    <w:p>
+      <w:pPr>
+        <w:pStyle w:val="ListParagraph"/>
+        <w:jc w:val="start"/>
+      </w:pPr>
+      <w:r>
+        <w:t>git clone git@github.com:meljahmi-personal/RBE550-Workspace.git</w:t>
+      </w:r>
+    </w:p>
+    <w:p>
+      <w:pPr>
+        <w:pStyle w:val="ListParagraph"/>
+        <w:jc w:val="start"/>
+      </w:pPr>
+      <w:r>
+        <w:lastRenderedPageBreak/>
+        <w:t>cd RBE550-Workspace</w:t>
+      </w:r>
+    </w:p>
+    <w:p>
+      <w:pPr>
+        <w:pStyle w:val="ListParagraph"/>
+        <w:jc w:val="start"/>
+      </w:pPr>
+      <w:r>
+        <w:t>./scripts/run_docker.sh --steps 10 --render-every 2 --no-show</w:t>
+      </w:r>
+    </w:p>
+    <w:p>
+      <w:pPr>
+        <w:pStyle w:val="ListParagraph"/>
+        <w:jc w:val="start"/>
+      </w:pPr>
+    </w:p>
+    <w:p>
+      <w:pPr>
+        <w:pStyle w:val="ListParagraph"/>
+        <w:jc w:val="start"/>
+      </w:pPr>
+      <w:r>
+        <w:t>Th</w:t>
+      </w:r>
+      <w:r>
+        <w:t>e last command</w:t>
+      </w:r>
+      <w:r>
+        <w:t xml:space="preserve"> builds the image, copies both src/ and maps/ into /ws/, compiles the workspace with colcon, and runs the benchmark. Outputs (logs, images, and GIFs) are saved to ./outputs/ on the host.</w:t>
+      </w:r>
+    </w:p>
+    <w:p>
+      <w:pPr>
+        <w:pStyle w:val="ListParagraph"/>
+        <w:jc w:val="start"/>
+      </w:pPr>
+    </w:p>
+    <w:p>
+      <w:pPr>
+        <w:pStyle w:val="ListParagraph"/>
+        <w:numPr>
+          <w:ilvl w:val="0"/>
+          <w:numId w:val="36"/>
+        </w:numPr>
+        <w:jc w:val="start"/>
+      </w:pPr>
+      <w:r>
+        <w:t>Local Build (Optional, ROS 2 Humble required)</w:t>
+      </w:r>
+    </w:p>
+    <w:p>
+      <w:pPr>
+        <w:pStyle w:val="ListParagraph"/>
+        <w:jc w:val="start"/>
+      </w:pPr>
+      <w:r>
+        <w:t>Users with ROS 2 installed can alternatively build and run locally:</w:t>
+      </w:r>
+    </w:p>
+    <w:p>
+      <w:pPr>
+        <w:pStyle w:val="ListParagraph"/>
+        <w:jc w:val="start"/>
+      </w:pPr>
+      <w:r>
+        <w:t>git clone git@github.com:meljahmi-personal/RBE550-Workspace.git</w:t>
+      </w:r>
+    </w:p>
+    <w:p>
+      <w:pPr>
+        <w:pStyle w:val="ListParagraph"/>
+        <w:jc w:val="start"/>
+      </w:pPr>
+      <w:r>
+        <w:t>cd RBE550-Workspace</w:t>
+      </w:r>
+    </w:p>
+    <w:p>
+      <w:pPr>
+        <w:pStyle w:val="ListParagraph"/>
         <w:jc w:val="start"/>
       </w:pPr>
       <w:r>
@@ -1579,37 +1685,95 @@
     </w:p>
     <w:p>
       <w:pPr>
-        <w:jc w:val="start"/>
-      </w:pPr>
-      <w:r>
-        <w:t>source install/</w:t>
-      </w:r>
-      <w:proofErr w:type="spellStart"/>
-      <w:r>
-        <w:t>setup.bash</w:t>
-      </w:r>
-      <w:proofErr w:type="spellEnd"/>
-    </w:p>
-    <w:p>
-      <w:pPr>
-        <w:jc w:val="start"/>
-      </w:pPr>
-      <w:r>
-        <w:t>./scripts/run_random64.sh</w:t>
-      </w:r>
-    </w:p>
-    <w:p>
-      <w:pPr>
-        <w:jc w:val="start"/>
-      </w:pPr>
-      <w:r>
-        <w:t>./scripts/run_maze32.sh</w:t>
-      </w:r>
-    </w:p>
-    <w:p>
-      <w:pPr>
-        <w:jc w:val="start"/>
-      </w:pPr>
+        <w:pStyle w:val="ListParagraph"/>
+        <w:jc w:val="start"/>
+      </w:pPr>
+      <w:r>
+        <w:t>./scripts/run.sh --grid 64 --fill 0.20 --seed 42 --algo astar --moves 8 --no-show</w:t>
+      </w:r>
+    </w:p>
+    <w:p>
+      <w:pPr>
+        <w:pStyle w:val="ListParagraph"/>
+        <w:jc w:val="start"/>
+      </w:pPr>
+    </w:p>
+    <w:p>
+      <w:pPr>
+        <w:pStyle w:val="ListParagraph"/>
+        <w:numPr>
+          <w:ilvl w:val="0"/>
+          <w:numId w:val="36"/>
+        </w:numPr>
+        <w:jc w:val="start"/>
+      </w:pPr>
+      <w:r>
+        <w:t>Submission and Exclusions</w:t>
+      </w:r>
+    </w:p>
+    <w:p>
+      <w:pPr>
+        <w:pStyle w:val="ListParagraph"/>
+        <w:jc w:val="start"/>
+      </w:pPr>
+      <w:r>
+        <w:t>The submission excludes generated artifacts to keep the repository lightweight:</w:t>
+      </w:r>
+    </w:p>
+    <w:p>
+      <w:pPr>
+        <w:pStyle w:val="ListParagraph"/>
+        <w:jc w:val="start"/>
+      </w:pPr>
+      <w:r>
+        <w:t>build/</w:t>
+      </w:r>
+    </w:p>
+    <w:p>
+      <w:pPr>
+        <w:pStyle w:val="ListParagraph"/>
+        <w:jc w:val="start"/>
+      </w:pPr>
+      <w:r>
+        <w:t>install/</w:t>
+      </w:r>
+    </w:p>
+    <w:p>
+      <w:pPr>
+        <w:pStyle w:val="ListParagraph"/>
+        <w:jc w:val="start"/>
+      </w:pPr>
+      <w:r>
+        <w:t>log/</w:t>
+      </w:r>
+    </w:p>
+    <w:p>
+      <w:pPr>
+        <w:pStyle w:val="ListParagraph"/>
+        <w:jc w:val="start"/>
+      </w:pPr>
+      <w:r>
+        <w:t>outputs/</w:t>
+      </w:r>
+    </w:p>
+    <w:p>
+      <w:pPr>
+        <w:pStyle w:val="ListParagraph"/>
+        <w:jc w:val="start"/>
+      </w:pPr>
+    </w:p>
+    <w:p>
+      <w:pPr>
+        <w:pStyle w:val="ListParagraph"/>
+        <w:jc w:val="start"/>
+      </w:pPr>
+      <w:r>
+        <w:t>Only source code, maps, scripts, and configuration files are included.</w:t>
+      </w:r>
+      <w:r>
+        <w:br/>
+        <w:t>These components are sufficient for anyone with Docker and SSH access to reproduce the reported results exactly.</w:t>
+      </w:r>
     </w:p>
     <w:p>
       <w:pPr>
@@ -1624,7 +1788,6 @@
           <w:sz w:val="24"/>
           <w:szCs w:val="24"/>
         </w:rPr>
-        <w:lastRenderedPageBreak/>
         <w:t>Preliminary Results</w:t>
       </w:r>
     </w:p>
@@ -1695,7 +1858,7 @@
                         <w:tblPr>
                           <w:tblStyle w:val="TableGrid"/>
                           <w:tblW w:w="283.10pt" w:type="dxa"/>
-                          <w:tblInd w:w="-1.65pt" w:type="dxa"/>
+                          <w:tblInd w:w="0.35pt" w:type="dxa"/>
                           <w:tblBorders>
                             <w:bottom w:val="none" w:sz="0" w:space="0" w:color="auto"/>
                           </w:tblBorders>
@@ -2373,7 +2536,10 @@
         <w:jc w:val="start"/>
       </w:pPr>
       <w:r>
-        <w:t>The immediate challenge is extending the current framework to incorporate the remaining planned algorithms—Dijkstra’s algorithm, Theta*, and Jump Point Search (JPS). Each requires careful integration into the common planner interface so that results remain directly comparable across methods. Beyond implementing the algorithms, additional effort is needed to ensure that metrics such as number of turns, memory consumption of open and closed lists, and success rates over multiple random seeds are systematically recorded and analyzed.</w:t>
+        <w:t xml:space="preserve">The immediate challenge is extending the current framework to incorporate the remaining planned algorithms—Dijkstra’s algorithm, Theta*, and Jump Point Search (JPS). Each </w:t>
+      </w:r>
+      <w:r>
+        <w:t>requires careful integration into the common planner interface so that results remain directly comparable across methods. Beyond implementing the algorithms, additional effort is needed to ensure that metrics such as number of turns, memory consumption of open and closed lists, and success rates over multiple random seeds are systematically recorded and analyzed.</w:t>
       </w:r>
     </w:p>
     <w:p>
@@ -2403,15 +2569,7 @@
         <w:jc w:val="start"/>
       </w:pPr>
       <w:r>
-        <w:t>Future iterations will focus on broadening the range of evaluated approaches. Variants of A* with weighted heuristics (</w:t>
-      </w:r>
-      <w:proofErr w:type="spellStart"/>
-      <w:r>
-        <w:t>wA</w:t>
-      </w:r>
-      <w:proofErr w:type="spellEnd"/>
-      <w:r>
-        <w:t>*) can be used to study suboptimality–efficiency trade-offs. Theta* will highlight the effect of allowing any-angle shortcuts, and JPS will demonstrate pruning-based acceleration in uniform-cost grids. Beyond the five core algorithms, the extensible design allows exploration of incremental search algorithms such as D* Lite, and in the longer term, policy-based methods inspired by reinforcement learning.</w:t>
+        <w:t>Future iterations will focus on broadening the range of evaluated approaches. Variants of A* with weighted heuristics (wA*) can be used to study suboptimality–efficiency trade-offs. Theta* will highlight the effect of allowing any-angle shortcuts, and JPS will demonstrate pruning-based acceleration in uniform-cost grids. Beyond the five core algorithms, the extensible design allows exploration of incremental search algorithms such as D* Lite, and in the longer term, policy-based methods inspired by reinforcement learning.</w:t>
       </w:r>
       <w:r>
         <w:t xml:space="preserve"> </w:t>
@@ -2530,6 +2688,7 @@
           <w:sz w:val="20"/>
           <w:szCs w:val="20"/>
         </w:rPr>
+        <w:lastRenderedPageBreak/>
         <w:t>E. F. Moore, “The shortest path through a maze,” in Proc. Int. Symp. Switching Theory, 1959, pp. 285–292.</w:t>
       </w:r>
     </w:p>
@@ -4291,6 +4450,95 @@
     </w:lvl>
   </w:abstractNum>
   <w:abstractNum w:abstractNumId="20" w15:restartNumberingAfterBreak="0">
+    <w:nsid w:val="398B5511"/>
+    <w:multiLevelType w:val="hybridMultilevel"/>
+    <w:tmpl w:val="4FA6F3FC"/>
+    <w:lvl w:ilvl="0" w:tplc="0409000F">
+      <w:start w:val="1"/>
+      <w:numFmt w:val="decimal"/>
+      <w:lvlText w:val="%1."/>
+      <w:lvlJc w:val="start"/>
+      <w:pPr>
+        <w:ind w:start="36pt" w:hanging="18pt"/>
+      </w:pPr>
+      <w:rPr>
+        <w:rFonts w:hint="default"/>
+      </w:rPr>
+    </w:lvl>
+    <w:lvl w:ilvl="1" w:tplc="04090019" w:tentative="1">
+      <w:start w:val="1"/>
+      <w:numFmt w:val="lowerLetter"/>
+      <w:lvlText w:val="%2."/>
+      <w:lvlJc w:val="start"/>
+      <w:pPr>
+        <w:ind w:start="72pt" w:hanging="18pt"/>
+      </w:pPr>
+    </w:lvl>
+    <w:lvl w:ilvl="2" w:tplc="0409001B" w:tentative="1">
+      <w:start w:val="1"/>
+      <w:numFmt w:val="lowerRoman"/>
+      <w:lvlText w:val="%3."/>
+      <w:lvlJc w:val="end"/>
+      <w:pPr>
+        <w:ind w:start="108pt" w:hanging="9pt"/>
+      </w:pPr>
+    </w:lvl>
+    <w:lvl w:ilvl="3" w:tplc="0409000F" w:tentative="1">
+      <w:start w:val="1"/>
+      <w:numFmt w:val="decimal"/>
+      <w:lvlText w:val="%4."/>
+      <w:lvlJc w:val="start"/>
+      <w:pPr>
+        <w:ind w:start="144pt" w:hanging="18pt"/>
+      </w:pPr>
+    </w:lvl>
+    <w:lvl w:ilvl="4" w:tplc="04090019" w:tentative="1">
+      <w:start w:val="1"/>
+      <w:numFmt w:val="lowerLetter"/>
+      <w:lvlText w:val="%5."/>
+      <w:lvlJc w:val="start"/>
+      <w:pPr>
+        <w:ind w:start="180pt" w:hanging="18pt"/>
+      </w:pPr>
+    </w:lvl>
+    <w:lvl w:ilvl="5" w:tplc="0409001B" w:tentative="1">
+      <w:start w:val="1"/>
+      <w:numFmt w:val="lowerRoman"/>
+      <w:lvlText w:val="%6."/>
+      <w:lvlJc w:val="end"/>
+      <w:pPr>
+        <w:ind w:start="216pt" w:hanging="9pt"/>
+      </w:pPr>
+    </w:lvl>
+    <w:lvl w:ilvl="6" w:tplc="0409000F" w:tentative="1">
+      <w:start w:val="1"/>
+      <w:numFmt w:val="decimal"/>
+      <w:lvlText w:val="%7."/>
+      <w:lvlJc w:val="start"/>
+      <w:pPr>
+        <w:ind w:start="252pt" w:hanging="18pt"/>
+      </w:pPr>
+    </w:lvl>
+    <w:lvl w:ilvl="7" w:tplc="04090019" w:tentative="1">
+      <w:start w:val="1"/>
+      <w:numFmt w:val="lowerLetter"/>
+      <w:lvlText w:val="%8."/>
+      <w:lvlJc w:val="start"/>
+      <w:pPr>
+        <w:ind w:start="288pt" w:hanging="18pt"/>
+      </w:pPr>
+    </w:lvl>
+    <w:lvl w:ilvl="8" w:tplc="0409001B" w:tentative="1">
+      <w:start w:val="1"/>
+      <w:numFmt w:val="lowerRoman"/>
+      <w:lvlText w:val="%9."/>
+      <w:lvlJc w:val="end"/>
+      <w:pPr>
+        <w:ind w:start="324pt" w:hanging="9pt"/>
+      </w:pPr>
+    </w:lvl>
+  </w:abstractNum>
+  <w:abstractNum w:abstractNumId="21" w15:restartNumberingAfterBreak="0">
     <w:nsid w:val="39E54FC6"/>
     <w:multiLevelType w:val="singleLevel"/>
     <w:tmpl w:val="5B7288D4"/>
@@ -4310,7 +4558,7 @@
       </w:rPr>
     </w:lvl>
   </w:abstractNum>
-  <w:abstractNum w:abstractNumId="21" w15:restartNumberingAfterBreak="0">
+  <w:abstractNum w:abstractNumId="22" w15:restartNumberingAfterBreak="0">
     <w:nsid w:val="3BDD560A"/>
     <w:multiLevelType w:val="hybridMultilevel"/>
     <w:tmpl w:val="EC5C338C"/>
@@ -4423,7 +4671,7 @@
       </w:rPr>
     </w:lvl>
   </w:abstractNum>
-  <w:abstractNum w:abstractNumId="22" w15:restartNumberingAfterBreak="0">
+  <w:abstractNum w:abstractNumId="23" w15:restartNumberingAfterBreak="0">
     <w:nsid w:val="4189603E"/>
     <w:multiLevelType w:val="multilevel"/>
     <w:tmpl w:val="0AB06E12"/>
@@ -4630,7 +4878,7 @@
       </w:rPr>
     </w:lvl>
   </w:abstractNum>
-  <w:abstractNum w:abstractNumId="23" w15:restartNumberingAfterBreak="0">
+  <w:abstractNum w:abstractNumId="24" w15:restartNumberingAfterBreak="0">
     <w:nsid w:val="41C01C63"/>
     <w:multiLevelType w:val="multilevel"/>
     <w:tmpl w:val="58CAB6CE"/>
@@ -4779,7 +5027,7 @@
       </w:rPr>
     </w:lvl>
   </w:abstractNum>
-  <w:abstractNum w:abstractNumId="24" w15:restartNumberingAfterBreak="0">
+  <w:abstractNum w:abstractNumId="25" w15:restartNumberingAfterBreak="0">
     <w:nsid w:val="493C3F76"/>
     <w:multiLevelType w:val="hybridMultilevel"/>
     <w:tmpl w:val="9A9E418C"/>
@@ -4890,7 +5138,7 @@
       </w:pPr>
     </w:lvl>
   </w:abstractNum>
-  <w:abstractNum w:abstractNumId="25" w15:restartNumberingAfterBreak="0">
+  <w:abstractNum w:abstractNumId="26" w15:restartNumberingAfterBreak="0">
     <w:nsid w:val="4F716868"/>
     <w:multiLevelType w:val="hybridMultilevel"/>
     <w:tmpl w:val="569CFB56"/>
@@ -5003,7 +5251,7 @@
       </w:rPr>
     </w:lvl>
   </w:abstractNum>
-  <w:abstractNum w:abstractNumId="26" w15:restartNumberingAfterBreak="0">
+  <w:abstractNum w:abstractNumId="27" w15:restartNumberingAfterBreak="0">
     <w:nsid w:val="52CA544A"/>
     <w:multiLevelType w:val="singleLevel"/>
     <w:tmpl w:val="AED6D67E"/>
@@ -5030,7 +5278,7 @@
       </w:rPr>
     </w:lvl>
   </w:abstractNum>
-  <w:abstractNum w:abstractNumId="27" w15:restartNumberingAfterBreak="0">
+  <w:abstractNum w:abstractNumId="28" w15:restartNumberingAfterBreak="0">
     <w:nsid w:val="59851F56"/>
     <w:multiLevelType w:val="multilevel"/>
     <w:tmpl w:val="C6368F24"/>
@@ -5179,7 +5427,7 @@
       </w:rPr>
     </w:lvl>
   </w:abstractNum>
-  <w:abstractNum w:abstractNumId="28" w15:restartNumberingAfterBreak="0">
+  <w:abstractNum w:abstractNumId="29" w15:restartNumberingAfterBreak="0">
     <w:nsid w:val="6C402C58"/>
     <w:multiLevelType w:val="hybridMultilevel"/>
     <w:tmpl w:val="9A1CA078"/>
@@ -5324,7 +5572,7 @@
       </w:rPr>
     </w:lvl>
   </w:abstractNum>
-  <w:abstractNum w:abstractNumId="29" w15:restartNumberingAfterBreak="0">
+  <w:abstractNum w:abstractNumId="30" w15:restartNumberingAfterBreak="0">
     <w:nsid w:val="6CD32DA8"/>
     <w:multiLevelType w:val="singleLevel"/>
     <w:tmpl w:val="166470C2"/>
@@ -5350,35 +5598,180 @@
       </w:rPr>
     </w:lvl>
   </w:abstractNum>
+  <w:abstractNum w:abstractNumId="31" w15:restartNumberingAfterBreak="0">
+    <w:nsid w:val="74E669F6"/>
+    <w:multiLevelType w:val="multilevel"/>
+    <w:tmpl w:val="F806BE24"/>
+    <w:lvl w:ilvl="0">
+      <w:start w:val="1"/>
+      <w:numFmt w:val="bullet"/>
+      <w:lvlText w:val=""/>
+      <w:lvlJc w:val="start"/>
+      <w:pPr>
+        <w:tabs>
+          <w:tab w:val="num" w:pos="36pt"/>
+        </w:tabs>
+        <w:ind w:start="36pt" w:hanging="18pt"/>
+      </w:pPr>
+      <w:rPr>
+        <w:rFonts w:ascii="Symbol" w:hAnsi="Symbol" w:hint="default"/>
+        <w:sz w:val="20"/>
+      </w:rPr>
+    </w:lvl>
+    <w:lvl w:ilvl="1">
+      <w:start w:val="1"/>
+      <w:numFmt w:val="upperLetter"/>
+      <w:lvlText w:val="%2."/>
+      <w:lvlJc w:val="start"/>
+      <w:pPr>
+        <w:ind w:start="72pt" w:hanging="18pt"/>
+      </w:pPr>
+      <w:rPr>
+        <w:rFonts w:hint="default"/>
+      </w:rPr>
+    </w:lvl>
+    <w:lvl w:ilvl="2" w:tentative="1">
+      <w:start w:val="1"/>
+      <w:numFmt w:val="bullet"/>
+      <w:lvlText w:val=""/>
+      <w:lvlJc w:val="start"/>
+      <w:pPr>
+        <w:tabs>
+          <w:tab w:val="num" w:pos="108pt"/>
+        </w:tabs>
+        <w:ind w:start="108pt" w:hanging="18pt"/>
+      </w:pPr>
+      <w:rPr>
+        <w:rFonts w:ascii="Wingdings" w:hAnsi="Wingdings" w:hint="default"/>
+        <w:sz w:val="20"/>
+      </w:rPr>
+    </w:lvl>
+    <w:lvl w:ilvl="3" w:tentative="1">
+      <w:start w:val="1"/>
+      <w:numFmt w:val="bullet"/>
+      <w:lvlText w:val=""/>
+      <w:lvlJc w:val="start"/>
+      <w:pPr>
+        <w:tabs>
+          <w:tab w:val="num" w:pos="144pt"/>
+        </w:tabs>
+        <w:ind w:start="144pt" w:hanging="18pt"/>
+      </w:pPr>
+      <w:rPr>
+        <w:rFonts w:ascii="Wingdings" w:hAnsi="Wingdings" w:hint="default"/>
+        <w:sz w:val="20"/>
+      </w:rPr>
+    </w:lvl>
+    <w:lvl w:ilvl="4" w:tentative="1">
+      <w:start w:val="1"/>
+      <w:numFmt w:val="bullet"/>
+      <w:lvlText w:val=""/>
+      <w:lvlJc w:val="start"/>
+      <w:pPr>
+        <w:tabs>
+          <w:tab w:val="num" w:pos="180pt"/>
+        </w:tabs>
+        <w:ind w:start="180pt" w:hanging="18pt"/>
+      </w:pPr>
+      <w:rPr>
+        <w:rFonts w:ascii="Wingdings" w:hAnsi="Wingdings" w:hint="default"/>
+        <w:sz w:val="20"/>
+      </w:rPr>
+    </w:lvl>
+    <w:lvl w:ilvl="5" w:tentative="1">
+      <w:start w:val="1"/>
+      <w:numFmt w:val="bullet"/>
+      <w:lvlText w:val=""/>
+      <w:lvlJc w:val="start"/>
+      <w:pPr>
+        <w:tabs>
+          <w:tab w:val="num" w:pos="216pt"/>
+        </w:tabs>
+        <w:ind w:start="216pt" w:hanging="18pt"/>
+      </w:pPr>
+      <w:rPr>
+        <w:rFonts w:ascii="Wingdings" w:hAnsi="Wingdings" w:hint="default"/>
+        <w:sz w:val="20"/>
+      </w:rPr>
+    </w:lvl>
+    <w:lvl w:ilvl="6" w:tentative="1">
+      <w:start w:val="1"/>
+      <w:numFmt w:val="bullet"/>
+      <w:lvlText w:val=""/>
+      <w:lvlJc w:val="start"/>
+      <w:pPr>
+        <w:tabs>
+          <w:tab w:val="num" w:pos="252pt"/>
+        </w:tabs>
+        <w:ind w:start="252pt" w:hanging="18pt"/>
+      </w:pPr>
+      <w:rPr>
+        <w:rFonts w:ascii="Wingdings" w:hAnsi="Wingdings" w:hint="default"/>
+        <w:sz w:val="20"/>
+      </w:rPr>
+    </w:lvl>
+    <w:lvl w:ilvl="7" w:tentative="1">
+      <w:start w:val="1"/>
+      <w:numFmt w:val="bullet"/>
+      <w:lvlText w:val=""/>
+      <w:lvlJc w:val="start"/>
+      <w:pPr>
+        <w:tabs>
+          <w:tab w:val="num" w:pos="288pt"/>
+        </w:tabs>
+        <w:ind w:start="288pt" w:hanging="18pt"/>
+      </w:pPr>
+      <w:rPr>
+        <w:rFonts w:ascii="Wingdings" w:hAnsi="Wingdings" w:hint="default"/>
+        <w:sz w:val="20"/>
+      </w:rPr>
+    </w:lvl>
+    <w:lvl w:ilvl="8" w:tentative="1">
+      <w:start w:val="1"/>
+      <w:numFmt w:val="bullet"/>
+      <w:lvlText w:val=""/>
+      <w:lvlJc w:val="start"/>
+      <w:pPr>
+        <w:tabs>
+          <w:tab w:val="num" w:pos="324pt"/>
+        </w:tabs>
+        <w:ind w:start="324pt" w:hanging="18pt"/>
+      </w:pPr>
+      <w:rPr>
+        <w:rFonts w:ascii="Wingdings" w:hAnsi="Wingdings" w:hint="default"/>
+        <w:sz w:val="20"/>
+      </w:rPr>
+    </w:lvl>
+  </w:abstractNum>
   <w:num w:numId="1" w16cid:durableId="940377641">
     <w:abstractNumId w:val="19"/>
   </w:num>
   <w:num w:numId="2" w16cid:durableId="1397439891">
-    <w:abstractNumId w:val="28"/>
+    <w:abstractNumId w:val="29"/>
   </w:num>
   <w:num w:numId="3" w16cid:durableId="539585121">
     <w:abstractNumId w:val="18"/>
   </w:num>
   <w:num w:numId="4" w16cid:durableId="1505513160">
-    <w:abstractNumId w:val="22"/>
+    <w:abstractNumId w:val="23"/>
   </w:num>
   <w:num w:numId="5" w16cid:durableId="978925957">
-    <w:abstractNumId w:val="22"/>
+    <w:abstractNumId w:val="23"/>
   </w:num>
   <w:num w:numId="6" w16cid:durableId="1721400726">
-    <w:abstractNumId w:val="22"/>
+    <w:abstractNumId w:val="23"/>
   </w:num>
   <w:num w:numId="7" w16cid:durableId="687826470">
-    <w:abstractNumId w:val="22"/>
+    <w:abstractNumId w:val="23"/>
   </w:num>
   <w:num w:numId="8" w16cid:durableId="143812469">
-    <w:abstractNumId w:val="26"/>
+    <w:abstractNumId w:val="27"/>
   </w:num>
   <w:num w:numId="9" w16cid:durableId="1364867722">
-    <w:abstractNumId w:val="29"/>
+    <w:abstractNumId w:val="30"/>
   </w:num>
   <w:num w:numId="10" w16cid:durableId="2029989048">
-    <w:abstractNumId w:val="20"/>
+    <w:abstractNumId w:val="21"/>
   </w:num>
   <w:num w:numId="11" w16cid:durableId="642739898">
     <w:abstractNumId w:val="16"/>
@@ -5420,22 +5813,22 @@
     <w:abstractNumId w:val="1"/>
   </w:num>
   <w:num w:numId="24" w16cid:durableId="1366640472">
-    <w:abstractNumId w:val="24"/>
+    <w:abstractNumId w:val="25"/>
   </w:num>
   <w:num w:numId="25" w16cid:durableId="1917282883">
-    <w:abstractNumId w:val="26"/>
+    <w:abstractNumId w:val="27"/>
   </w:num>
   <w:num w:numId="26" w16cid:durableId="1466772736">
     <w:abstractNumId w:val="14"/>
   </w:num>
   <w:num w:numId="27" w16cid:durableId="1057825152">
-    <w:abstractNumId w:val="23"/>
+    <w:abstractNumId w:val="24"/>
   </w:num>
   <w:num w:numId="28" w16cid:durableId="1769081536">
-    <w:abstractNumId w:val="27"/>
+    <w:abstractNumId w:val="28"/>
   </w:num>
   <w:num w:numId="29" w16cid:durableId="913012818">
-    <w:abstractNumId w:val="21"/>
+    <w:abstractNumId w:val="22"/>
   </w:num>
   <w:num w:numId="30" w16cid:durableId="1016923067">
     <w:abstractNumId w:val="17"/>
@@ -5447,10 +5840,16 @@
     <w:abstractNumId w:val="12"/>
   </w:num>
   <w:num w:numId="33" w16cid:durableId="145096952">
-    <w:abstractNumId w:val="25"/>
+    <w:abstractNumId w:val="26"/>
   </w:num>
   <w:num w:numId="34" w16cid:durableId="24529045">
     <w:abstractNumId w:val="13"/>
+  </w:num>
+  <w:num w:numId="35" w16cid:durableId="1784879140">
+    <w:abstractNumId w:val="31"/>
+  </w:num>
+  <w:num w:numId="36" w16cid:durableId="965311006">
+    <w:abstractNumId w:val="20"/>
   </w:num>
 </w:numbering>
 </file>
@@ -5873,7 +6272,6 @@
   <w:style w:type="character" w:default="1" w:styleId="DefaultParagraphFont">
     <w:name w:val="Default Paragraph Font"/>
     <w:uiPriority w:val="1"/>
-    <w:semiHidden/>
     <w:unhideWhenUsed/>
   </w:style>
   <w:style w:type="table" w:default="1" w:styleId="TableNormal">

</xml_diff>

<commit_message>
preparation for submission, update and remove spaces from file names.
</commit_message>
<xml_diff>
--- a/project_status_October_6/status/meljahmi_RBE550_October_6_status.docx
+++ b/project_status_October_6/status/meljahmi_RBE550_October_6_status.docx
@@ -282,10 +282,7 @@
         <w:jc w:val="start"/>
       </w:pPr>
       <w:r>
-        <w:t xml:space="preserve">Path planning is a fundamental problem in robotics and artificial intelligence. Mobile robots, manipulators, and autonomous agents must be able to navigate from an initial configuration to a goal while avoiding obstacles. Among the many approaches to path planning, grid-based search provides a simple yet powerful model: the workspace is discretized into </w:t>
-      </w:r>
-      <w:r>
-        <w:t>cells that are either free or occupied, and algorithms explore this graph to connect the start and goal states.</w:t>
+        <w:t>Path planning is a fundamental problem in robotics and artificial intelligence. Mobile robots, manipulators, and autonomous agents must be able to navigate from an initial configuration to a goal while avoiding obstacles. Among the many approaches to path planning, grid-based search provides a simple yet powerful model: the workspace is discretized into cells that are either free or occupied, and algorithms explore this graph to connect the start and goal states.</w:t>
       </w:r>
     </w:p>
     <w:p>
@@ -356,7 +353,6 @@
           <w:sz w:val="24"/>
           <w:szCs w:val="24"/>
         </w:rPr>
-        <w:lastRenderedPageBreak/>
         <w:t>Background</w:t>
       </w:r>
     </w:p>
@@ -528,7 +524,15 @@
         <w:t>J</w:t>
       </w:r>
       <w:r>
-        <w:t>PS is an optimization for uniform-cost grids that skips over symmetric intermediate states. By “jumping” directly to critical nodes, JPS dramatically reduces the number of expansions while preserving optimality</w:t>
+        <w:t xml:space="preserve">PS is an optimization for uniform-cost grids that </w:t>
+      </w:r>
+      <w:proofErr w:type="gramStart"/>
+      <w:r>
+        <w:t>skips</w:t>
+      </w:r>
+      <w:proofErr w:type="gramEnd"/>
+      <w:r>
+        <w:t xml:space="preserve"> over symmetric intermediate states. By “jumping” directly to critical nodes, JPS dramatically reduces the number of expansions while preserving optimality</w:t>
       </w:r>
       <w:r>
         <w:t>.</w:t>
@@ -725,6 +729,7 @@
       <w:r>
         <w:t xml:space="preserve">, provides the benchmarking utilities and planner implementations. The build system is based on </w:t>
       </w:r>
+      <w:proofErr w:type="spellStart"/>
       <w:r>
         <w:rPr>
           <w:b/>
@@ -746,6 +751,7 @@
         </w:rPr>
         <w:t>on</w:t>
       </w:r>
+      <w:proofErr w:type="spellEnd"/>
       <w:r>
         <w:t>, and helper scripts (build.sh and run.sh) simplify compilation, environment setup, and experiment execution.</w:t>
       </w:r>
@@ -944,7 +950,23 @@
         <w:jc w:val="start"/>
       </w:pPr>
       <w:r>
-        <w:t>def plan(grid, start, goal, neighbors_fn) -&gt; (path, stats)</w:t>
+        <w:t xml:space="preserve">def </w:t>
+      </w:r>
+      <w:proofErr w:type="gramStart"/>
+      <w:r>
+        <w:t>plan(</w:t>
+      </w:r>
+      <w:proofErr w:type="gramEnd"/>
+      <w:r>
+        <w:t xml:space="preserve">grid, start, goal, </w:t>
+      </w:r>
+      <w:proofErr w:type="spellStart"/>
+      <w:r>
+        <w:t>neighbors_fn</w:t>
+      </w:r>
+      <w:proofErr w:type="spellEnd"/>
+      <w:r>
+        <w:t>) -&gt; (path, stats)</w:t>
       </w:r>
     </w:p>
     <w:p>
@@ -997,21 +1019,25 @@
         </w:numPr>
         <w:jc w:val="start"/>
       </w:pPr>
-      <w:r>
-        <w:t>neighbors_fn selects 4- or 8-connected motion.</w:t>
-      </w:r>
-    </w:p>
-    <w:p>
-      <w:pPr>
-        <w:jc w:val="start"/>
-      </w:pPr>
-    </w:p>
-    <w:p>
-      <w:pPr>
-        <w:jc w:val="start"/>
-      </w:pPr>
-      <w:r>
-        <w:lastRenderedPageBreak/>
+      <w:proofErr w:type="spellStart"/>
+      <w:r>
+        <w:t>neighbors_fn</w:t>
+      </w:r>
+      <w:proofErr w:type="spellEnd"/>
+      <w:r>
+        <w:t xml:space="preserve"> selects 4- or 8-connected motion.</w:t>
+      </w:r>
+    </w:p>
+    <w:p>
+      <w:pPr>
+        <w:jc w:val="start"/>
+      </w:pPr>
+    </w:p>
+    <w:p>
+      <w:pPr>
+        <w:jc w:val="start"/>
+      </w:pPr>
+      <w:r>
         <w:t>Each planner returns a path (list of grid cells) and a stats dictionary (runtime, nodes expanded, path length in steps; memory/turns where available).</w:t>
       </w:r>
     </w:p>
@@ -1358,10 +1384,15 @@
         </w:rPr>
       </w:pPr>
       <w:r>
-        <w:t xml:space="preserve">Each run reports results in a structured format, printed to the console and optionally saved for later analysis. The harness ensures that all planners are evaluated under identical conditions. In particular, it supports varying the cost model (4-connected vs. 8-connected grids) and heuristic functions (Manhattan vs. Euclidean) so that differences between </w:t>
-      </w:r>
-      <w:r>
-        <w:t>algorithmic approaches can be measured systematically.</w:t>
+        <w:t xml:space="preserve">Each run reports results in a structured format, printed to the console and optionally saved for later analysis. The harness ensures that all planners are evaluated under identical conditions. </w:t>
+      </w:r>
+      <w:proofErr w:type="gramStart"/>
+      <w:r>
+        <w:t>In particular, it</w:t>
+      </w:r>
+      <w:proofErr w:type="gramEnd"/>
+      <w:r>
+        <w:t xml:space="preserve"> supports varying the cost model (4-connected vs. 8-connected grids) and heuristic functions (Manhattan vs. Euclidean) so that differences between algorithmic approaches can be measured systematically.</w:t>
       </w:r>
       <w:r>
         <w:t xml:space="preserve"> </w:t>
@@ -1498,8 +1529,21 @@
         </w:numPr>
         <w:jc w:val="start"/>
       </w:pPr>
-      <w:r>
-        <w:t>src/rbe550_grid_bench/ — core ROS 2 package (BFS and A* implementations).</w:t>
+      <w:proofErr w:type="spellStart"/>
+      <w:r>
+        <w:t>src</w:t>
+      </w:r>
+      <w:proofErr w:type="spellEnd"/>
+      <w:r>
+        <w:t>/rbe550_grid_</w:t>
+      </w:r>
+      <w:proofErr w:type="gramStart"/>
+      <w:r>
+        <w:t>bench/ —</w:t>
+      </w:r>
+      <w:proofErr w:type="gramEnd"/>
+      <w:r>
+        <w:t xml:space="preserve"> core ROS 2 package (BFS and A* implementations).</w:t>
       </w:r>
     </w:p>
     <w:p>
@@ -1510,8 +1554,13 @@
         </w:numPr>
         <w:jc w:val="start"/>
       </w:pPr>
-      <w:r>
-        <w:t>maps/ — ASCII map files (e.g., maze_32.txt).</w:t>
+      <w:proofErr w:type="gramStart"/>
+      <w:r>
+        <w:t>maps/ —</w:t>
+      </w:r>
+      <w:proofErr w:type="gramEnd"/>
+      <w:r>
+        <w:t xml:space="preserve"> ASCII map files (e.g., maze_32.txt).</w:t>
       </w:r>
     </w:p>
     <w:p>
@@ -1522,8 +1571,13 @@
         </w:numPr>
         <w:jc w:val="start"/>
       </w:pPr>
-      <w:r>
-        <w:t>scripts/ — helper scripts for build and execution, both local and Docker.</w:t>
+      <w:proofErr w:type="gramStart"/>
+      <w:r>
+        <w:t>scripts/ —</w:t>
+      </w:r>
+      <w:proofErr w:type="gramEnd"/>
+      <w:r>
+        <w:t xml:space="preserve"> helper scripts for build and execution, both local and Docker.</w:t>
       </w:r>
     </w:p>
     <w:p>
@@ -1534,8 +1588,26 @@
         </w:numPr>
         <w:jc w:val="start"/>
       </w:pPr>
-      <w:r>
-        <w:t>Dockerfile and .dockerignore — define a self-contained, reproducible build.</w:t>
+      <w:proofErr w:type="spellStart"/>
+      <w:r>
+        <w:t>Dockerfile</w:t>
+      </w:r>
+      <w:proofErr w:type="spellEnd"/>
+      <w:r>
+        <w:t xml:space="preserve"> </w:t>
+      </w:r>
+      <w:proofErr w:type="gramStart"/>
+      <w:r>
+        <w:t>and .</w:t>
+      </w:r>
+      <w:proofErr w:type="spellStart"/>
+      <w:r>
+        <w:t>dockerignore</w:t>
+      </w:r>
+      <w:proofErr w:type="spellEnd"/>
+      <w:proofErr w:type="gramEnd"/>
+      <w:r>
+        <w:t xml:space="preserve"> — define a self-contained, reproducible build.</w:t>
       </w:r>
     </w:p>
     <w:p>
@@ -1585,8 +1657,18 @@
         <w:jc w:val="start"/>
       </w:pPr>
       <w:r>
-        <w:t>git clone git@github.com:meljahmi-personal/RBE550-Workspace.git</w:t>
-      </w:r>
+        <w:t xml:space="preserve">git clone </w:t>
+      </w:r>
+      <w:proofErr w:type="spellStart"/>
+      <w:proofErr w:type="gramStart"/>
+      <w:r>
+        <w:t>git@github.com:meljahmi-personal</w:t>
+      </w:r>
+      <w:proofErr w:type="spellEnd"/>
+      <w:r>
+        <w:t>/RBE550-Workspace.git</w:t>
+      </w:r>
+      <w:proofErr w:type="gramEnd"/>
     </w:p>
     <w:p>
       <w:pPr>
@@ -1594,7 +1676,6 @@
         <w:jc w:val="start"/>
       </w:pPr>
       <w:r>
-        <w:lastRenderedPageBreak/>
         <w:t>cd RBE550-Workspace</w:t>
       </w:r>
     </w:p>
@@ -1625,7 +1706,39 @@
         <w:t>e last command</w:t>
       </w:r>
       <w:r>
-        <w:t xml:space="preserve"> builds the image, copies both src/ and maps/ into /ws/, compiles the workspace with colcon, and runs the benchmark. Outputs (logs, images, and GIFs) are saved to ./outputs/ on the host.</w:t>
+        <w:t xml:space="preserve"> builds the image, copies both </w:t>
+      </w:r>
+      <w:proofErr w:type="spellStart"/>
+      <w:r>
+        <w:t>src</w:t>
+      </w:r>
+      <w:proofErr w:type="spellEnd"/>
+      <w:r>
+        <w:t>/ and maps/ into /</w:t>
+      </w:r>
+      <w:proofErr w:type="spellStart"/>
+      <w:r>
+        <w:t>ws</w:t>
+      </w:r>
+      <w:proofErr w:type="spellEnd"/>
+      <w:r>
+        <w:t xml:space="preserve">/, compiles the workspace with </w:t>
+      </w:r>
+      <w:proofErr w:type="spellStart"/>
+      <w:r>
+        <w:t>colcon</w:t>
+      </w:r>
+      <w:proofErr w:type="spellEnd"/>
+      <w:r>
+        <w:t xml:space="preserve">, and runs the benchmark. Outputs (logs, images, and GIFs) are saved </w:t>
+      </w:r>
+      <w:proofErr w:type="gramStart"/>
+      <w:r>
+        <w:t>to .</w:t>
+      </w:r>
+      <w:proofErr w:type="gramEnd"/>
+      <w:r>
+        <w:t>/outputs/ on the host.</w:t>
       </w:r>
     </w:p>
     <w:p>
@@ -1662,8 +1775,18 @@
         <w:jc w:val="start"/>
       </w:pPr>
       <w:r>
-        <w:t>git clone git@github.com:meljahmi-personal/RBE550-Workspace.git</w:t>
-      </w:r>
+        <w:t xml:space="preserve">git clone </w:t>
+      </w:r>
+      <w:proofErr w:type="spellStart"/>
+      <w:proofErr w:type="gramStart"/>
+      <w:r>
+        <w:t>git@github.com:meljahmi-personal</w:t>
+      </w:r>
+      <w:proofErr w:type="spellEnd"/>
+      <w:r>
+        <w:t>/RBE550-Workspace.git</w:t>
+      </w:r>
+      <w:proofErr w:type="gramEnd"/>
     </w:p>
     <w:p>
       <w:pPr>
@@ -1689,7 +1812,15 @@
         <w:jc w:val="start"/>
       </w:pPr>
       <w:r>
-        <w:t>./scripts/run.sh --grid 64 --fill 0.20 --seed 42 --algo astar --moves 8 --no-show</w:t>
+        <w:t xml:space="preserve">./scripts/run.sh --grid 64 --fill 0.20 --seed 42 --algo </w:t>
+      </w:r>
+      <w:proofErr w:type="spellStart"/>
+      <w:r>
+        <w:t>astar</w:t>
+      </w:r>
+      <w:proofErr w:type="spellEnd"/>
+      <w:r>
+        <w:t xml:space="preserve"> --moves 8 --no-show</w:t>
       </w:r>
     </w:p>
     <w:p>
@@ -1710,6 +1841,9 @@
       <w:r>
         <w:t>Submission and Exclusions</w:t>
       </w:r>
+      <w:r>
+        <w:t>:</w:t>
+      </w:r>
     </w:p>
     <w:p>
       <w:pPr>
@@ -1774,6 +1908,76 @@
         <w:br/>
         <w:t>These components are sufficient for anyone with Docker and SSH access to reproduce the reported results exactly.</w:t>
       </w:r>
+    </w:p>
+    <w:p>
+      <w:pPr>
+        <w:pStyle w:val="ListParagraph"/>
+        <w:jc w:val="start"/>
+      </w:pPr>
+    </w:p>
+    <w:p>
+      <w:pPr>
+        <w:pStyle w:val="ListParagraph"/>
+        <w:numPr>
+          <w:ilvl w:val="0"/>
+          <w:numId w:val="36"/>
+        </w:numPr>
+        <w:jc w:val="start"/>
+      </w:pPr>
+      <w:r>
+        <w:t>Project Documentation Repository</w:t>
+      </w:r>
+      <w:r>
+        <w:t>:</w:t>
+      </w:r>
+    </w:p>
+    <w:p>
+      <w:pPr>
+        <w:pStyle w:val="ListParagraph"/>
+        <w:jc w:val="start"/>
+      </w:pPr>
+      <w:r>
+        <w:t>In addition to the code workspace, all written project documents — including the proposal, status reports, and presentation materials — are hosted in a separate GitHub repository for transparency and version control:</w:t>
+      </w:r>
+    </w:p>
+    <w:p>
+      <w:pPr>
+        <w:pStyle w:val="ListParagraph"/>
+        <w:jc w:val="start"/>
+      </w:pPr>
+      <w:hyperlink r:id="rId12" w:history="1">
+        <w:r>
+          <w:rPr>
+            <w:rStyle w:val="Hyperlink"/>
+          </w:rPr>
+          <w:t>git@github.com:meljahmi-personal/RBE550-project-proposal.git</w:t>
+        </w:r>
+      </w:hyperlink>
+    </w:p>
+    <w:p>
+      <w:pPr>
+        <w:pStyle w:val="ListParagraph"/>
+        <w:jc w:val="start"/>
+      </w:pPr>
+    </w:p>
+    <w:p>
+      <w:pPr>
+        <w:pStyle w:val="ListParagraph"/>
+        <w:jc w:val="start"/>
+      </w:pPr>
+      <w:r>
+        <w:t>The October 6 status report and related figures are located under:</w:t>
+      </w:r>
+      <w:r>
+        <w:br/>
+        <w:t>project_status_October_6/status/</w:t>
+      </w:r>
+    </w:p>
+    <w:p>
+      <w:pPr>
+        <w:pStyle w:val="ListParagraph"/>
+        <w:jc w:val="start"/>
+      </w:pPr>
     </w:p>
     <w:p>
       <w:pPr>
@@ -2536,10 +2740,7 @@
         <w:jc w:val="start"/>
       </w:pPr>
       <w:r>
-        <w:t xml:space="preserve">The immediate challenge is extending the current framework to incorporate the remaining planned algorithms—Dijkstra’s algorithm, Theta*, and Jump Point Search (JPS). Each </w:t>
-      </w:r>
-      <w:r>
-        <w:t>requires careful integration into the common planner interface so that results remain directly comparable across methods. Beyond implementing the algorithms, additional effort is needed to ensure that metrics such as number of turns, memory consumption of open and closed lists, and success rates over multiple random seeds are systematically recorded and analyzed.</w:t>
+        <w:t>The immediate challenge is extending the current framework to incorporate the remaining planned algorithms—Dijkstra’s algorithm, Theta*, and Jump Point Search (JPS). Each requires careful integration into the common planner interface so that results remain directly comparable across methods. Beyond implementing the algorithms, additional effort is needed to ensure that metrics such as number of turns, memory consumption of open and closed lists, and success rates over multiple random seeds are systematically recorded and analyzed.</w:t>
       </w:r>
     </w:p>
     <w:p>
@@ -2569,7 +2770,15 @@
         <w:jc w:val="start"/>
       </w:pPr>
       <w:r>
-        <w:t>Future iterations will focus on broadening the range of evaluated approaches. Variants of A* with weighted heuristics (wA*) can be used to study suboptimality–efficiency trade-offs. Theta* will highlight the effect of allowing any-angle shortcuts, and JPS will demonstrate pruning-based acceleration in uniform-cost grids. Beyond the five core algorithms, the extensible design allows exploration of incremental search algorithms such as D* Lite, and in the longer term, policy-based methods inspired by reinforcement learning.</w:t>
+        <w:t>Future iterations will focus on broadening the range of evaluated approaches. Variants of A* with weighted heuristics (</w:t>
+      </w:r>
+      <w:proofErr w:type="spellStart"/>
+      <w:r>
+        <w:t>wA</w:t>
+      </w:r>
+      <w:proofErr w:type="spellEnd"/>
+      <w:r>
+        <w:t>*) can be used to study suboptimality–efficiency trade-offs. Theta* will highlight the effect of allowing any-angle shortcuts, and JPS will demonstrate pruning-based acceleration in uniform-cost grids. Beyond the five core algorithms, the extensible design allows exploration of incremental search algorithms such as D* Lite, and in the longer term, policy-based methods inspired by reinforcement learning.</w:t>
       </w:r>
       <w:r>
         <w:t xml:space="preserve"> </w:t>
@@ -2688,7 +2897,6 @@
           <w:sz w:val="20"/>
           <w:szCs w:val="20"/>
         </w:rPr>
-        <w:lastRenderedPageBreak/>
         <w:t>E. F. Moore, “The shortest path through a maze,” in Proc. Int. Symp. Switching Theory, 1959, pp. 285–292.</w:t>
       </w:r>
     </w:p>
@@ -6272,6 +6480,7 @@
   <w:style w:type="character" w:default="1" w:styleId="DefaultParagraphFont">
     <w:name w:val="Default Paragraph Font"/>
     <w:uiPriority w:val="1"/>
+    <w:semiHidden/>
     <w:unhideWhenUsed/>
   </w:style>
   <w:style w:type="table" w:default="1" w:styleId="TableNormal">

</xml_diff>